<commit_message>
Add live URLs to README and report
</commit_message>
<xml_diff>
--- a/docs/report/Lexicon_Report.docx
+++ b/docs/report/Lexicon_Report.docx
@@ -2,8 +2,6 @@
 <file path=word/document.xml><?xml version="1.0" encoding="utf-8"?>
 <w:document xmlns:wpc="http://schemas.microsoft.com/office/word/2010/wordprocessingCanvas" xmlns:cx="http://schemas.microsoft.com/office/drawing/2014/chartex" xmlns:mc="http://schemas.openxmlformats.org/markup-compatibility/2006" xmlns:o="urn:schemas-microsoft-com:office:office" xmlns:r="http://schemas.openxmlformats.org/officeDocument/2006/relationships" xmlns:m="http://schemas.openxmlformats.org/officeDocument/2006/math" xmlns:v="urn:schemas-microsoft-com:vml" xmlns:wp14="http://schemas.microsoft.com/office/word/2010/wordprocessingDrawing" xmlns:wp="http://schemas.openxmlformats.org/drawingml/2006/wordprocessingDrawing" xmlns:w10="urn:schemas-microsoft-com:office:word" xmlns:w="http://schemas.openxmlformats.org/wordprocessingml/2006/main" xmlns:w14="http://schemas.microsoft.com/office/word/2010/wordml" xmlns:w15="http://schemas.microsoft.com/office/word/2012/wordml" xmlns:w16se="http://schemas.microsoft.com/office/word/2015/wordml/symex" xmlns:wpg="http://schemas.microsoft.com/office/word/2010/wordprocessingGroup" xmlns:wpi="http://schemas.microsoft.com/office/word/2010/wordprocessingInk" xmlns:wne="http://schemas.microsoft.com/office/word/2006/wordml" xmlns:wps="http://schemas.microsoft.com/office/word/2010/wordprocessingShape" mc:Ignorable="w14 w15 w16se wp14">
   <w:body>
-    <w:bookmarkStart w:id="0" w:name="_GoBack"/>
-    <w:bookmarkEnd w:id="0"/>
     <w:p>
       <w:pPr>
         <w:spacing w:after="0" w:line="259" w:lineRule="auto"/>
@@ -30,7 +28,7 @@
                 <wp:extent cx="7560000" cy="10692000"/>
                 <wp:effectExtent l="0" t="0" r="0" b="0"/>
                 <wp:wrapTopAndBottom/>
-                <wp:docPr id="7468" name="Group 7468"/>
+                <wp:docPr id="7655" name="Group 7655"/>
                 <wp:cNvGraphicFramePr/>
                 <a:graphic xmlns:a="http://schemas.openxmlformats.org/drawingml/2006/main">
                   <a:graphicData uri="http://schemas.microsoft.com/office/word/2010/wordprocessingGroup">
@@ -45,7 +43,7 @@
                         </a:xfrm>
                       </wpg:grpSpPr>
                       <wps:wsp>
-                        <wps:cNvPr id="10976" name="Shape 10976"/>
+                        <wps:cNvPr id="10994" name="Shape 10994"/>
                         <wps:cNvSpPr/>
                         <wps:spPr>
                           <a:xfrm>
@@ -99,7 +97,7 @@
                         <wps:bodyPr/>
                       </wps:wsp>
                       <wps:wsp>
-                        <wps:cNvPr id="10977" name="Shape 10977"/>
+                        <wps:cNvPr id="10995" name="Shape 10995"/>
                         <wps:cNvSpPr/>
                         <wps:spPr>
                           <a:xfrm>
@@ -388,12 +386,12 @@
           </mc:Choice>
           <mc:Fallback xmlns:a="http://schemas.openxmlformats.org/drawingml/2006/main">
             <w:pict>
-              <v:group id="Group 7468" style="width:595.276pt;height:841.89pt;position:absolute;mso-position-horizontal-relative:page;mso-position-horizontal:absolute;margin-left:0pt;mso-position-vertical-relative:page;margin-top:0pt;" coordsize="75600,106920">
-                <v:shape id="Shape 10978" style="position:absolute;width:75600;height:106920;left:0;top:0;" coordsize="7560000,10692000" path="m0,0l7560000,0l7560000,10692000l0,10692000l0,0">
+              <v:group id="Group 7655" style="width:595.276pt;height:841.89pt;position:absolute;mso-position-horizontal-relative:page;mso-position-horizontal:absolute;margin-left:0pt;mso-position-vertical-relative:page;margin-top:0pt;" coordsize="75600,106920">
+                <v:shape id="Shape 10996" style="position:absolute;width:75600;height:106920;left:0;top:0;" coordsize="7560000,10692000" path="m0,0l7560000,0l7560000,10692000l0,10692000l0,0">
                   <v:stroke weight="0pt" endcap="flat" joinstyle="miter" miterlimit="10" on="false" color="#000000" opacity="0"/>
                   <v:fill on="true" color="#14213d"/>
                 </v:shape>
-                <v:shape id="Shape 10979" style="position:absolute;width:10800;height:900;left:9000;top:43020;" coordsize="1080000,90000" path="m0,0l1080000,0l1080000,90000l0,90000l0,0">
+                <v:shape id="Shape 10997" style="position:absolute;width:10800;height:900;left:9000;top:43020;" coordsize="1080000,90000" path="m0,0l1080000,0l1080000,90000l0,90000l0,0">
                   <v:stroke weight="0pt" endcap="flat" joinstyle="miter" miterlimit="10" on="false" color="#000000" opacity="0"/>
                   <v:fill on="true" color="#ffe066"/>
                 </v:shape>
@@ -616,6 +614,8 @@
         </w:rPr>
         <w:t>Semantic search versus keyword search</w:t>
       </w:r>
+      <w:bookmarkStart w:id="0" w:name="_GoBack"/>
+      <w:bookmarkEnd w:id="0"/>
     </w:p>
     <w:p>
       <w:pPr>
@@ -2058,7 +2058,7 @@
               <wp:inline distT="0" distB="0" distL="0" distR="0">
                 <wp:extent cx="5760000" cy="1955800"/>
                 <wp:effectExtent l="0" t="0" r="0" b="0"/>
-                <wp:docPr id="10030" name="Group 10030"/>
+                <wp:docPr id="10347" name="Group 10347"/>
                 <wp:cNvGraphicFramePr/>
                 <a:graphic xmlns:a="http://schemas.openxmlformats.org/drawingml/2006/main">
                   <a:graphicData uri="http://schemas.microsoft.com/office/word/2010/wordprocessingGroup">
@@ -2073,7 +2073,7 @@
                         </a:xfrm>
                       </wpg:grpSpPr>
                       <wps:wsp>
-                        <wps:cNvPr id="11018" name="Shape 11018"/>
+                        <wps:cNvPr id="11036" name="Shape 11036"/>
                         <wps:cNvSpPr/>
                         <wps:spPr>
                           <a:xfrm>
@@ -2127,7 +2127,7 @@
                         <wps:bodyPr/>
                       </wps:wsp>
                       <wps:wsp>
-                        <wps:cNvPr id="11019" name="Shape 11019"/>
+                        <wps:cNvPr id="11037" name="Shape 11037"/>
                         <wps:cNvSpPr/>
                         <wps:spPr>
                           <a:xfrm>
@@ -2181,7 +2181,7 @@
                         <wps:bodyPr/>
                       </wps:wsp>
                       <wps:wsp>
-                        <wps:cNvPr id="11020" name="Shape 11020"/>
+                        <wps:cNvPr id="11038" name="Shape 11038"/>
                         <wps:cNvSpPr/>
                         <wps:spPr>
                           <a:xfrm>
@@ -2235,7 +2235,7 @@
                         <wps:bodyPr/>
                       </wps:wsp>
                       <wps:wsp>
-                        <wps:cNvPr id="11021" name="Shape 11021"/>
+                        <wps:cNvPr id="11039" name="Shape 11039"/>
                         <wps:cNvSpPr/>
                         <wps:spPr>
                           <a:xfrm>
@@ -2289,7 +2289,7 @@
                         <wps:bodyPr/>
                       </wps:wsp>
                       <wps:wsp>
-                        <wps:cNvPr id="11022" name="Shape 11022"/>
+                        <wps:cNvPr id="11040" name="Shape 11040"/>
                         <wps:cNvSpPr/>
                         <wps:spPr>
                           <a:xfrm>
@@ -2343,7 +2343,7 @@
                         <wps:bodyPr/>
                       </wps:wsp>
                       <wps:wsp>
-                        <wps:cNvPr id="11023" name="Shape 11023"/>
+                        <wps:cNvPr id="11041" name="Shape 11041"/>
                         <wps:cNvSpPr/>
                         <wps:spPr>
                           <a:xfrm>
@@ -3373,28 +3373,28 @@
           </mc:Choice>
           <mc:Fallback xmlns:a="http://schemas.openxmlformats.org/drawingml/2006/main">
             <w:pict>
-              <v:group id="Group 10030" style="width:453.543pt;height:154pt;mso-position-horizontal-relative:char;mso-position-vertical-relative:line" coordsize="57600,19558">
-                <v:shape id="Shape 11024" style="position:absolute;width:57600;height:2794;left:0;top:5588;" coordsize="5760000,279400" path="m0,0l5760000,0l5760000,279400l0,279400l0,0">
+              <v:group id="Group 10347" style="width:453.543pt;height:154pt;mso-position-horizontal-relative:char;mso-position-vertical-relative:line" coordsize="57600,19558">
+                <v:shape id="Shape 11042" style="position:absolute;width:57600;height:2794;left:0;top:5588;" coordsize="5760000,279400" path="m0,0l5760000,0l5760000,279400l0,279400l0,0">
                   <v:stroke weight="0pt" endcap="flat" joinstyle="miter" miterlimit="10" on="false" color="#000000" opacity="0"/>
                   <v:fill on="true" color="#eef1f6"/>
                 </v:shape>
-                <v:shape id="Shape 11025" style="position:absolute;width:57600;height:2794;left:0;top:8382;" coordsize="5760000,279400" path="m0,0l5760000,0l5760000,279400l0,279400l0,0">
+                <v:shape id="Shape 11043" style="position:absolute;width:57600;height:2794;left:0;top:8382;" coordsize="5760000,279400" path="m0,0l5760000,0l5760000,279400l0,279400l0,0">
                   <v:stroke weight="0pt" endcap="flat" joinstyle="miter" miterlimit="10" on="false" color="#000000" opacity="0"/>
                   <v:fill on="true" color="#ffffff"/>
                 </v:shape>
-                <v:shape id="Shape 11026" style="position:absolute;width:57600;height:2794;left:0;top:11176;" coordsize="5760000,279400" path="m0,0l5760000,0l5760000,279400l0,279400l0,0">
+                <v:shape id="Shape 11044" style="position:absolute;width:57600;height:2794;left:0;top:11176;" coordsize="5760000,279400" path="m0,0l5760000,0l5760000,279400l0,279400l0,0">
                   <v:stroke weight="0pt" endcap="flat" joinstyle="miter" miterlimit="10" on="false" color="#000000" opacity="0"/>
                   <v:fill on="true" color="#eef1f6"/>
                 </v:shape>
-                <v:shape id="Shape 11027" style="position:absolute;width:57600;height:2794;left:0;top:13970;" coordsize="5760000,279400" path="m0,0l5760000,0l5760000,279400l0,279400l0,0">
+                <v:shape id="Shape 11045" style="position:absolute;width:57600;height:2794;left:0;top:13970;" coordsize="5760000,279400" path="m0,0l5760000,0l5760000,279400l0,279400l0,0">
                   <v:stroke weight="0pt" endcap="flat" joinstyle="miter" miterlimit="10" on="false" color="#000000" opacity="0"/>
                   <v:fill on="true" color="#ffffff"/>
                 </v:shape>
-                <v:shape id="Shape 11028" style="position:absolute;width:57600;height:2794;left:0;top:16764;" coordsize="5760000,279400" path="m0,0l5760000,0l5760000,279400l0,279400l0,0">
+                <v:shape id="Shape 11046" style="position:absolute;width:57600;height:2794;left:0;top:16764;" coordsize="5760000,279400" path="m0,0l5760000,0l5760000,279400l0,279400l0,0">
                   <v:stroke weight="0pt" endcap="flat" joinstyle="miter" miterlimit="10" on="false" color="#000000" opacity="0"/>
                   <v:fill on="true" color="#eef1f6"/>
                 </v:shape>
-                <v:shape id="Shape 11029" style="position:absolute;width:57600;height:2794;left:0;top:0;" coordsize="5760000,279400" path="m0,0l5760000,0l5760000,279400l0,279400l0,0">
+                <v:shape id="Shape 11047" style="position:absolute;width:57600;height:2794;left:0;top:0;" coordsize="5760000,279400" path="m0,0l5760000,0l5760000,279400l0,279400l0,0">
                   <v:stroke weight="0pt" endcap="flat" joinstyle="miter" miterlimit="10" on="false" color="#000000" opacity="0"/>
                   <v:fill on="true" color="#2f4bdb"/>
                 </v:shape>
@@ -6283,7 +6283,7 @@
           <w:ilvl w:val="0"/>
           <w:numId w:val="7"/>
         </w:numPr>
-        <w:spacing w:after="201"/>
+        <w:spacing w:after="172"/>
         <w:ind w:hanging="220"/>
       </w:pPr>
       <w:r>
@@ -6292,77 +6292,41 @@
     </w:p>
     <w:p>
       <w:pPr>
-        <w:tabs>
-          <w:tab w:val="center" w:pos="930"/>
-          <w:tab w:val="center" w:pos="1740"/>
-          <w:tab w:val="center" w:pos="2538"/>
-          <w:tab w:val="center" w:pos="4668"/>
-          <w:tab w:val="center" w:pos="6551"/>
-          <w:tab w:val="center" w:pos="6815"/>
-          <w:tab w:val="center" w:pos="7079"/>
-          <w:tab w:val="center" w:pos="7709"/>
-          <w:tab w:val="right" w:pos="8831"/>
-        </w:tabs>
-        <w:spacing w:after="3"/>
-        <w:ind w:left="-15" w:firstLine="0"/>
-        <w:jc w:val="left"/>
+        <w:spacing w:after="304" w:line="297" w:lineRule="auto"/>
+        <w:ind w:left="0" w:firstLine="0"/>
       </w:pPr>
       <w:r>
         <w:rPr>
           <w:b/>
         </w:rPr>
-        <w:t xml:space="preserve">Live </w:t>
+        <w:t>Live links:</w:t>
+      </w:r>
+      <w:r>
+        <w:t xml:space="preserve"> Frontend (Firebase Hosting): </w:t>
       </w:r>
       <w:r>
         <w:rPr>
-          <w:b/>
+          <w:color w:val="2F4BDB"/>
         </w:rPr>
-        <w:tab/>
-        <w:t>links:</w:t>
-      </w:r>
-      <w:r>
-        <w:t xml:space="preserve"> </w:t>
-      </w:r>
-      <w:r>
-        <w:tab/>
-        <w:t xml:space="preserve">Vercel </w:t>
-      </w:r>
-      <w:r>
-        <w:tab/>
-        <w:t xml:space="preserve">URL: </w:t>
-      </w:r>
-      <w:r>
-        <w:tab/>
-        <w:t xml:space="preserve">______________________________ </w:t>
-      </w:r>
-      <w:r>
-        <w:tab/>
-        <w:t xml:space="preserve"> </w:t>
-      </w:r>
-      <w:r>
-        <w:tab/>
-        <w:t xml:space="preserve"> </w:t>
-      </w:r>
-      <w:r>
-        <w:tab/>
-        <w:t xml:space="preserve"> </w:t>
-      </w:r>
-      <w:r>
-        <w:tab/>
-        <w:t xml:space="preserve">Firebase </w:t>
-      </w:r>
-      <w:r>
-        <w:tab/>
-        <w:t>URL:</w:t>
-      </w:r>
-    </w:p>
-    <w:p>
-      <w:pPr>
-        <w:spacing w:after="302"/>
-        <w:ind w:left="-5"/>
-      </w:pPr>
-      <w:r>
-        <w:t>______________________________</w:t>
+        <w:t>https://lexicon-docqa.web.app</w:t>
+      </w:r>
+      <w:r>
+        <w:t xml:space="preserve">  |  Backend and API documentation (Vercel): </w:t>
+      </w:r>
+      <w:r>
+        <w:rPr>
+          <w:color w:val="2F4BDB"/>
+        </w:rPr>
+        <w:t>https://lexicon-docqa.vercel.app</w:t>
+      </w:r>
+      <w:r>
+        <w:t xml:space="preserve">  |  Source code: </w:t>
+      </w:r>
+      <w:r>
+        <w:rPr>
+          <w:color w:val="2F4BDB"/>
+        </w:rPr>
+        <w:t>https://github.com/scientistayat-engineer/lexicon-docqa</w:t>
       </w:r>
     </w:p>
     <w:p>
@@ -6380,10 +6344,10 @@
         <w:ind w:left="-5"/>
       </w:pPr>
       <w:r>
-        <w:t xml:space="preserve">Automated tests (pytest) cover the chunking function and the API's health and input validation. The retrieval and generation paths were designed to be exercised through the application itself, using the Compare prompts and Semantic </w:t>
-      </w:r>
-      <w:r>
-        <w:t>vs keyword tabs.</w:t>
+        <w:t>Automated tests (pytest) cover the chunking function and the API's health and input validation. The retrieval and generation p</w:t>
+      </w:r>
+      <w:r>
+        <w:t>aths were designed to be exercised through the application itself, using the Compare prompts and Semantic vs keyword tabs.</w:t>
       </w:r>
     </w:p>
     <w:p>
@@ -6408,7 +6372,10 @@
         <w:ind w:hanging="220"/>
       </w:pPr>
       <w:r>
-        <w:t>On Vercel the vector store is in memory: uploaded files last only while the instance is warm and the first request after idle time is slow because the model must load.</w:t>
+        <w:t xml:space="preserve">On Vercel the vector store is in memory: uploaded files last only while the instance is warm and the first request </w:t>
+      </w:r>
+      <w:r>
+        <w:t>after idle time is slow because the model must load.</w:t>
       </w:r>
     </w:p>
     <w:p>
@@ -6420,10 +6387,7 @@
         <w:ind w:hanging="220"/>
       </w:pPr>
       <w:r>
-        <w:t>Uploads are limited to about 4.5 MB per request on Ve</w:t>
-      </w:r>
-      <w:r>
-        <w:t>rcel.</w:t>
+        <w:t>Uploads are limited to about 4.5 MB per request on Vercel.</w:t>
       </w:r>
     </w:p>
     <w:p>
@@ -6435,7 +6399,10 @@
         <w:ind w:hanging="220"/>
       </w:pPr>
       <w:r>
-        <w:t>Scores in the comparison come from an LLM judge, which is useful for relative comparison but is not a human evaluation and can vary slightly between runs.</w:t>
+        <w:t>Scores in the comparison come from an LLM judge, which is useful for relative comparison but is not a human evaluation and can vary slightly bet</w:t>
+      </w:r>
+      <w:r>
+        <w:t>ween runs.</w:t>
       </w:r>
     </w:p>
     <w:p>
@@ -6473,10 +6440,7 @@
         <w:ind w:hanging="220"/>
       </w:pPr>
       <w:r>
-        <w:t>P</w:t>
-      </w:r>
-      <w:r>
-        <w:t>ersistent storage (a hosted vector database) so uploads survive restarts.</w:t>
+        <w:t>Persistent storage (a hosted vector database) so uploads survive restarts.</w:t>
       </w:r>
     </w:p>
     <w:p>
@@ -6488,7 +6452,10 @@
         <w:ind w:hanging="220"/>
       </w:pPr>
       <w:r>
-        <w:t>Hybrid search that merges keyword and semantic scores, and a re-ranking step.</w:t>
+        <w:t>Hybrid search that merges keyword and semantic scores, and a re-ranking step</w:t>
+      </w:r>
+      <w:r>
+        <w:t>.</w:t>
       </w:r>
     </w:p>
     <w:p>
@@ -6518,13 +6485,13 @@
         <w:ind w:left="-5"/>
       </w:pPr>
       <w:r>
-        <w:t xml:space="preserve">Lexicon demonstrates the full RAG workflow: documents are chunked, embedded and stored in ChromaDB; questions are matched to the most similar chunks by semantic search; and a language model answers from that evidence using a carefully designed prompt. The </w:t>
-      </w:r>
-      <w:r>
-        <w:t>comparison of zero-shot, few-shot and role-based prompting shows that how a question is framed changes the quality of the answer even when the retrieved evidence is identical, and the semantic versus keyword comparison shows why embeddings are the right fo</w:t>
-      </w:r>
-      <w:r>
-        <w:t>undation for question answering over documents.</w:t>
+        <w:t xml:space="preserve">Lexicon demonstrates the full RAG workflow: documents are chunked, embedded and stored in ChromaDB; questions are matched to the most similar chunks by semantic search; and a language model </w:t>
+      </w:r>
+      <w:r>
+        <w:t>answers from that evidence using a carefully designed prompt. The comparison of zero-shot, few-shot and role-based prompting shows that how a question is framed changes the quality of the answer even when the retrieved evidence is identical, and the semant</w:t>
+      </w:r>
+      <w:r>
+        <w:t>ic versus keyword comparison shows why embeddings are the right foundation for question answering over documents.</w:t>
       </w:r>
     </w:p>
     <w:p>
@@ -6559,14 +6526,7 @@
           <w:rFonts w:ascii="Courier New" w:eastAsia="Courier New" w:hAnsi="Courier New" w:cs="Courier New"/>
           <w:sz w:val="17"/>
         </w:rPr>
-        <w:t>python -m venv venv venv\Scripts\activate          (Mac/Linux: source venv/bin/activate) pip install -r requirements.txt copy .env.example .env         (add GROQ_API_KEY) uvicorn</w:t>
-      </w:r>
-      <w:r>
-        <w:rPr>
-          <w:rFonts w:ascii="Courier New" w:eastAsia="Courier New" w:hAnsi="Courier New" w:cs="Courier New"/>
-          <w:sz w:val="17"/>
-        </w:rPr>
-        <w:t xml:space="preserve"> app.main:app --reload</w:t>
+        <w:t>python -m venv venv venv\Scripts\activate          (Mac/Linux: source venv/bin/activate) pip install -r requirements.txt copy .env.example .env         (add GROQ_API_KEY) uvicorn app.main:app --reload</w:t>
       </w:r>
     </w:p>
     <w:p>
@@ -6608,7 +6568,14 @@
           <w:rFonts w:ascii="Courier New" w:eastAsia="Courier New" w:hAnsi="Courier New" w:cs="Courier New"/>
           <w:sz w:val="17"/>
         </w:rPr>
-        <w:t>Run tests: pip install -r requirements-dev.txt &amp;&amp; pytest</w:t>
+        <w:t>Run tests: pip install -r re</w:t>
+      </w:r>
+      <w:r>
+        <w:rPr>
+          <w:rFonts w:ascii="Courier New" w:eastAsia="Courier New" w:hAnsi="Courier New" w:cs="Courier New"/>
+          <w:sz w:val="17"/>
+        </w:rPr>
+        <w:t>quirements-dev.txt &amp;&amp; pytest</w:t>
       </w:r>
     </w:p>
     <w:sectPr>
@@ -6619,7 +6586,7 @@
       <w:headerReference w:type="first" r:id="rId11"/>
       <w:footerReference w:type="first" r:id="rId12"/>
       <w:pgSz w:w="11906" w:h="16838"/>
-      <w:pgMar w:top="1537" w:right="1537" w:bottom="1658" w:left="1537" w:header="720" w:footer="720" w:gutter="0"/>
+      <w:pgMar w:top="1537" w:right="1537" w:bottom="1498" w:left="1537" w:header="720" w:footer="720" w:gutter="0"/>
       <w:pgNumType w:start="0"/>
       <w:cols w:space="720"/>
       <w:titlePg/>
@@ -6730,7 +6697,7 @@
         <w:color w:val="5B6785"/>
         <w:sz w:val="17"/>
       </w:rPr>
-      <w:t>1</w:t>
+      <w:t>10</w:t>
     </w:r>
     <w:r>
       <w:rPr>
@@ -6809,7 +6776,7 @@
               <wp:extent cx="5760000" cy="12700"/>
               <wp:effectExtent l="0" t="0" r="0" b="0"/>
               <wp:wrapSquare wrapText="bothSides"/>
-              <wp:docPr id="10564" name="Group 10564"/>
+              <wp:docPr id="10585" name="Group 10585"/>
               <wp:cNvGraphicFramePr/>
               <a:graphic xmlns:a="http://schemas.openxmlformats.org/drawingml/2006/main">
                 <a:graphicData uri="http://schemas.microsoft.com/office/word/2010/wordprocessingGroup">
@@ -6824,7 +6791,7 @@
                       </a:xfrm>
                     </wpg:grpSpPr>
                     <wps:wsp>
-                      <wps:cNvPr id="10565" name="Shape 10565"/>
+                      <wps:cNvPr id="10586" name="Shape 10586"/>
                       <wps:cNvSpPr/>
                       <wps:spPr>
                         <a:xfrm>
@@ -6876,8 +6843,8 @@
         </mc:Choice>
         <mc:Fallback xmlns:a="http://schemas.openxmlformats.org/drawingml/2006/main">
           <w:pict>
-            <v:group id="Group 10564" style="width:453.543pt;height:1pt;position:absolute;mso-position-horizontal-relative:page;mso-position-horizontal:absolute;margin-left:70.8661pt;mso-position-vertical-relative:page;margin-top:51.0237pt;" coordsize="57600,127">
-              <v:shape id="Shape 10565" style="position:absolute;width:57600;height:0;left:0;top:0;" coordsize="5760000,0" path="m0,0l5760000,0">
+            <v:group id="Group 10585" style="width:453.543pt;height:1pt;position:absolute;mso-position-horizontal-relative:page;mso-position-horizontal:absolute;margin-left:70.8661pt;mso-position-vertical-relative:page;margin-top:51.0237pt;" coordsize="57600,127">
+              <v:shape id="Shape 10586" style="position:absolute;width:57600;height:0;left:0;top:0;" coordsize="5760000,0" path="m0,0l5760000,0">
                 <v:stroke weight="1pt" endcap="flat" joinstyle="miter" miterlimit="10" on="true" color="#d6dce8"/>
                 <v:fill on="false" color="#000000" opacity="0"/>
               </v:shape>
@@ -6927,7 +6894,7 @@
               <wp:extent cx="5760000" cy="12700"/>
               <wp:effectExtent l="0" t="0" r="0" b="0"/>
               <wp:wrapSquare wrapText="bothSides"/>
-              <wp:docPr id="10549" name="Group 10549"/>
+              <wp:docPr id="10570" name="Group 10570"/>
               <wp:cNvGraphicFramePr/>
               <a:graphic xmlns:a="http://schemas.openxmlformats.org/drawingml/2006/main">
                 <a:graphicData uri="http://schemas.microsoft.com/office/word/2010/wordprocessingGroup">
@@ -6942,7 +6909,7 @@
                       </a:xfrm>
                     </wpg:grpSpPr>
                     <wps:wsp>
-                      <wps:cNvPr id="10550" name="Shape 10550"/>
+                      <wps:cNvPr id="10571" name="Shape 10571"/>
                       <wps:cNvSpPr/>
                       <wps:spPr>
                         <a:xfrm>
@@ -6994,8 +6961,8 @@
         </mc:Choice>
         <mc:Fallback xmlns:a="http://schemas.openxmlformats.org/drawingml/2006/main">
           <w:pict>
-            <v:group id="Group 10549" style="width:453.543pt;height:1pt;position:absolute;mso-position-horizontal-relative:page;mso-position-horizontal:absolute;margin-left:70.8661pt;mso-position-vertical-relative:page;margin-top:51.0237pt;" coordsize="57600,127">
-              <v:shape id="Shape 10550" style="position:absolute;width:57600;height:0;left:0;top:0;" coordsize="5760000,0" path="m0,0l5760000,0">
+            <v:group id="Group 10570" style="width:453.543pt;height:1pt;position:absolute;mso-position-horizontal-relative:page;mso-position-horizontal:absolute;margin-left:70.8661pt;mso-position-vertical-relative:page;margin-top:51.0237pt;" coordsize="57600,127">
+              <v:shape id="Shape 10571" style="position:absolute;width:57600;height:0;left:0;top:0;" coordsize="5760000,0" path="m0,0l5760000,0">
                 <v:stroke weight="1pt" endcap="flat" joinstyle="miter" miterlimit="10" on="true" color="#d6dce8"/>
                 <v:fill on="false" color="#000000" opacity="0"/>
               </v:shape>
@@ -7032,16 +6999,652 @@
 <file path=word/numbering.xml><?xml version="1.0" encoding="utf-8"?>
 <w:numbering xmlns:wpc="http://schemas.microsoft.com/office/word/2010/wordprocessingCanvas" xmlns:cx="http://schemas.microsoft.com/office/drawing/2014/chartex" xmlns:mc="http://schemas.openxmlformats.org/markup-compatibility/2006" xmlns:o="urn:schemas-microsoft-com:office:office" xmlns:r="http://schemas.openxmlformats.org/officeDocument/2006/relationships" xmlns:m="http://schemas.openxmlformats.org/officeDocument/2006/math" xmlns:v="urn:schemas-microsoft-com:vml" xmlns:wp14="http://schemas.microsoft.com/office/word/2010/wordprocessingDrawing" xmlns:wp="http://schemas.openxmlformats.org/drawingml/2006/wordprocessingDrawing" xmlns:w10="urn:schemas-microsoft-com:office:word" xmlns:w="http://schemas.openxmlformats.org/wordprocessingml/2006/main" xmlns:w14="http://schemas.microsoft.com/office/word/2010/wordml" xmlns:w15="http://schemas.microsoft.com/office/word/2012/wordml" xmlns:w16se="http://schemas.microsoft.com/office/word/2015/wordml/symex" xmlns:wpg="http://schemas.microsoft.com/office/word/2010/wordprocessingGroup" xmlns:wpi="http://schemas.microsoft.com/office/word/2010/wordprocessingInk" xmlns:wne="http://schemas.microsoft.com/office/word/2006/wordml" xmlns:wps="http://schemas.microsoft.com/office/word/2010/wordprocessingShape" mc:Ignorable="w14 w15 w16se wp14">
   <w:abstractNum w:abstractNumId="0" w15:restartNumberingAfterBreak="0">
-    <w:nsid w:val="05EC68AF"/>
+    <w:nsid w:val="061463D1"/>
     <w:multiLevelType w:val="hybridMultilevel"/>
-    <w:tmpl w:val="86BE8CD0"/>
-    <w:lvl w:ilvl="0" w:tplc="8222BFDA">
-      <w:start w:val="3"/>
+    <w:tmpl w:val="26DC0CF8"/>
+    <w:lvl w:ilvl="0" w:tplc="CCBA82C4">
+      <w:start w:val="1"/>
+      <w:numFmt w:val="bullet"/>
+      <w:lvlText w:val="-"/>
+      <w:lvlJc w:val="left"/>
+      <w:pPr>
+        <w:ind w:left="220"/>
+      </w:pPr>
+      <w:rPr>
+        <w:rFonts w:ascii="Arial" w:eastAsia="Arial" w:hAnsi="Arial" w:cs="Arial"/>
+        <w:b w:val="0"/>
+        <w:i w:val="0"/>
+        <w:strike w:val="0"/>
+        <w:dstrike w:val="0"/>
+        <w:color w:val="14213D"/>
+        <w:sz w:val="20"/>
+        <w:szCs w:val="20"/>
+        <w:u w:val="none" w:color="000000"/>
+        <w:bdr w:val="none" w:sz="0" w:space="0" w:color="auto"/>
+        <w:shd w:val="clear" w:color="auto" w:fill="auto"/>
+        <w:vertAlign w:val="baseline"/>
+      </w:rPr>
+    </w:lvl>
+    <w:lvl w:ilvl="1" w:tplc="0594730C">
+      <w:start w:val="1"/>
+      <w:numFmt w:val="bullet"/>
+      <w:lvlText w:val="o"/>
+      <w:lvlJc w:val="left"/>
+      <w:pPr>
+        <w:ind w:left="1140"/>
+      </w:pPr>
+      <w:rPr>
+        <w:rFonts w:ascii="Arial" w:eastAsia="Arial" w:hAnsi="Arial" w:cs="Arial"/>
+        <w:b w:val="0"/>
+        <w:i w:val="0"/>
+        <w:strike w:val="0"/>
+        <w:dstrike w:val="0"/>
+        <w:color w:val="14213D"/>
+        <w:sz w:val="20"/>
+        <w:szCs w:val="20"/>
+        <w:u w:val="none" w:color="000000"/>
+        <w:bdr w:val="none" w:sz="0" w:space="0" w:color="auto"/>
+        <w:shd w:val="clear" w:color="auto" w:fill="auto"/>
+        <w:vertAlign w:val="baseline"/>
+      </w:rPr>
+    </w:lvl>
+    <w:lvl w:ilvl="2" w:tplc="F774BD38">
+      <w:start w:val="1"/>
+      <w:numFmt w:val="bullet"/>
+      <w:lvlText w:val="▪"/>
+      <w:lvlJc w:val="left"/>
+      <w:pPr>
+        <w:ind w:left="1860"/>
+      </w:pPr>
+      <w:rPr>
+        <w:rFonts w:ascii="Arial" w:eastAsia="Arial" w:hAnsi="Arial" w:cs="Arial"/>
+        <w:b w:val="0"/>
+        <w:i w:val="0"/>
+        <w:strike w:val="0"/>
+        <w:dstrike w:val="0"/>
+        <w:color w:val="14213D"/>
+        <w:sz w:val="20"/>
+        <w:szCs w:val="20"/>
+        <w:u w:val="none" w:color="000000"/>
+        <w:bdr w:val="none" w:sz="0" w:space="0" w:color="auto"/>
+        <w:shd w:val="clear" w:color="auto" w:fill="auto"/>
+        <w:vertAlign w:val="baseline"/>
+      </w:rPr>
+    </w:lvl>
+    <w:lvl w:ilvl="3" w:tplc="90DE20A6">
+      <w:start w:val="1"/>
+      <w:numFmt w:val="bullet"/>
+      <w:lvlText w:val="•"/>
+      <w:lvlJc w:val="left"/>
+      <w:pPr>
+        <w:ind w:left="2580"/>
+      </w:pPr>
+      <w:rPr>
+        <w:rFonts w:ascii="Arial" w:eastAsia="Arial" w:hAnsi="Arial" w:cs="Arial"/>
+        <w:b w:val="0"/>
+        <w:i w:val="0"/>
+        <w:strike w:val="0"/>
+        <w:dstrike w:val="0"/>
+        <w:color w:val="14213D"/>
+        <w:sz w:val="20"/>
+        <w:szCs w:val="20"/>
+        <w:u w:val="none" w:color="000000"/>
+        <w:bdr w:val="none" w:sz="0" w:space="0" w:color="auto"/>
+        <w:shd w:val="clear" w:color="auto" w:fill="auto"/>
+        <w:vertAlign w:val="baseline"/>
+      </w:rPr>
+    </w:lvl>
+    <w:lvl w:ilvl="4" w:tplc="E1E48C7A">
+      <w:start w:val="1"/>
+      <w:numFmt w:val="bullet"/>
+      <w:lvlText w:val="o"/>
+      <w:lvlJc w:val="left"/>
+      <w:pPr>
+        <w:ind w:left="3300"/>
+      </w:pPr>
+      <w:rPr>
+        <w:rFonts w:ascii="Arial" w:eastAsia="Arial" w:hAnsi="Arial" w:cs="Arial"/>
+        <w:b w:val="0"/>
+        <w:i w:val="0"/>
+        <w:strike w:val="0"/>
+        <w:dstrike w:val="0"/>
+        <w:color w:val="14213D"/>
+        <w:sz w:val="20"/>
+        <w:szCs w:val="20"/>
+        <w:u w:val="none" w:color="000000"/>
+        <w:bdr w:val="none" w:sz="0" w:space="0" w:color="auto"/>
+        <w:shd w:val="clear" w:color="auto" w:fill="auto"/>
+        <w:vertAlign w:val="baseline"/>
+      </w:rPr>
+    </w:lvl>
+    <w:lvl w:ilvl="5" w:tplc="CC6CD4EC">
+      <w:start w:val="1"/>
+      <w:numFmt w:val="bullet"/>
+      <w:lvlText w:val="▪"/>
+      <w:lvlJc w:val="left"/>
+      <w:pPr>
+        <w:ind w:left="4020"/>
+      </w:pPr>
+      <w:rPr>
+        <w:rFonts w:ascii="Arial" w:eastAsia="Arial" w:hAnsi="Arial" w:cs="Arial"/>
+        <w:b w:val="0"/>
+        <w:i w:val="0"/>
+        <w:strike w:val="0"/>
+        <w:dstrike w:val="0"/>
+        <w:color w:val="14213D"/>
+        <w:sz w:val="20"/>
+        <w:szCs w:val="20"/>
+        <w:u w:val="none" w:color="000000"/>
+        <w:bdr w:val="none" w:sz="0" w:space="0" w:color="auto"/>
+        <w:shd w:val="clear" w:color="auto" w:fill="auto"/>
+        <w:vertAlign w:val="baseline"/>
+      </w:rPr>
+    </w:lvl>
+    <w:lvl w:ilvl="6" w:tplc="E53A6A7C">
+      <w:start w:val="1"/>
+      <w:numFmt w:val="bullet"/>
+      <w:lvlText w:val="•"/>
+      <w:lvlJc w:val="left"/>
+      <w:pPr>
+        <w:ind w:left="4740"/>
+      </w:pPr>
+      <w:rPr>
+        <w:rFonts w:ascii="Arial" w:eastAsia="Arial" w:hAnsi="Arial" w:cs="Arial"/>
+        <w:b w:val="0"/>
+        <w:i w:val="0"/>
+        <w:strike w:val="0"/>
+        <w:dstrike w:val="0"/>
+        <w:color w:val="14213D"/>
+        <w:sz w:val="20"/>
+        <w:szCs w:val="20"/>
+        <w:u w:val="none" w:color="000000"/>
+        <w:bdr w:val="none" w:sz="0" w:space="0" w:color="auto"/>
+        <w:shd w:val="clear" w:color="auto" w:fill="auto"/>
+        <w:vertAlign w:val="baseline"/>
+      </w:rPr>
+    </w:lvl>
+    <w:lvl w:ilvl="7" w:tplc="8AA21368">
+      <w:start w:val="1"/>
+      <w:numFmt w:val="bullet"/>
+      <w:lvlText w:val="o"/>
+      <w:lvlJc w:val="left"/>
+      <w:pPr>
+        <w:ind w:left="5460"/>
+      </w:pPr>
+      <w:rPr>
+        <w:rFonts w:ascii="Arial" w:eastAsia="Arial" w:hAnsi="Arial" w:cs="Arial"/>
+        <w:b w:val="0"/>
+        <w:i w:val="0"/>
+        <w:strike w:val="0"/>
+        <w:dstrike w:val="0"/>
+        <w:color w:val="14213D"/>
+        <w:sz w:val="20"/>
+        <w:szCs w:val="20"/>
+        <w:u w:val="none" w:color="000000"/>
+        <w:bdr w:val="none" w:sz="0" w:space="0" w:color="auto"/>
+        <w:shd w:val="clear" w:color="auto" w:fill="auto"/>
+        <w:vertAlign w:val="baseline"/>
+      </w:rPr>
+    </w:lvl>
+    <w:lvl w:ilvl="8" w:tplc="F8B01FAE">
+      <w:start w:val="1"/>
+      <w:numFmt w:val="bullet"/>
+      <w:lvlText w:val="▪"/>
+      <w:lvlJc w:val="left"/>
+      <w:pPr>
+        <w:ind w:left="6180"/>
+      </w:pPr>
+      <w:rPr>
+        <w:rFonts w:ascii="Arial" w:eastAsia="Arial" w:hAnsi="Arial" w:cs="Arial"/>
+        <w:b w:val="0"/>
+        <w:i w:val="0"/>
+        <w:strike w:val="0"/>
+        <w:dstrike w:val="0"/>
+        <w:color w:val="14213D"/>
+        <w:sz w:val="20"/>
+        <w:szCs w:val="20"/>
+        <w:u w:val="none" w:color="000000"/>
+        <w:bdr w:val="none" w:sz="0" w:space="0" w:color="auto"/>
+        <w:shd w:val="clear" w:color="auto" w:fill="auto"/>
+        <w:vertAlign w:val="baseline"/>
+      </w:rPr>
+    </w:lvl>
+  </w:abstractNum>
+  <w:abstractNum w:abstractNumId="1" w15:restartNumberingAfterBreak="0">
+    <w:nsid w:val="0D4A0281"/>
+    <w:multiLevelType w:val="hybridMultilevel"/>
+    <w:tmpl w:val="9C1C83F8"/>
+    <w:lvl w:ilvl="0" w:tplc="65C808CC">
+      <w:start w:val="1"/>
+      <w:numFmt w:val="bullet"/>
+      <w:lvlText w:val="-"/>
+      <w:lvlJc w:val="left"/>
+      <w:pPr>
+        <w:ind w:left="235"/>
+      </w:pPr>
+      <w:rPr>
+        <w:rFonts w:ascii="Arial" w:eastAsia="Arial" w:hAnsi="Arial" w:cs="Arial"/>
+        <w:b w:val="0"/>
+        <w:i w:val="0"/>
+        <w:strike w:val="0"/>
+        <w:dstrike w:val="0"/>
+        <w:color w:val="14213D"/>
+        <w:sz w:val="20"/>
+        <w:szCs w:val="20"/>
+        <w:u w:val="none" w:color="000000"/>
+        <w:bdr w:val="none" w:sz="0" w:space="0" w:color="auto"/>
+        <w:shd w:val="clear" w:color="auto" w:fill="auto"/>
+        <w:vertAlign w:val="baseline"/>
+      </w:rPr>
+    </w:lvl>
+    <w:lvl w:ilvl="1" w:tplc="F17CB75A">
+      <w:start w:val="1"/>
+      <w:numFmt w:val="bullet"/>
+      <w:lvlText w:val="o"/>
+      <w:lvlJc w:val="left"/>
+      <w:pPr>
+        <w:ind w:left="1140"/>
+      </w:pPr>
+      <w:rPr>
+        <w:rFonts w:ascii="Arial" w:eastAsia="Arial" w:hAnsi="Arial" w:cs="Arial"/>
+        <w:b w:val="0"/>
+        <w:i w:val="0"/>
+        <w:strike w:val="0"/>
+        <w:dstrike w:val="0"/>
+        <w:color w:val="14213D"/>
+        <w:sz w:val="20"/>
+        <w:szCs w:val="20"/>
+        <w:u w:val="none" w:color="000000"/>
+        <w:bdr w:val="none" w:sz="0" w:space="0" w:color="auto"/>
+        <w:shd w:val="clear" w:color="auto" w:fill="auto"/>
+        <w:vertAlign w:val="baseline"/>
+      </w:rPr>
+    </w:lvl>
+    <w:lvl w:ilvl="2" w:tplc="866C6AD4">
+      <w:start w:val="1"/>
+      <w:numFmt w:val="bullet"/>
+      <w:lvlText w:val="▪"/>
+      <w:lvlJc w:val="left"/>
+      <w:pPr>
+        <w:ind w:left="1860"/>
+      </w:pPr>
+      <w:rPr>
+        <w:rFonts w:ascii="Arial" w:eastAsia="Arial" w:hAnsi="Arial" w:cs="Arial"/>
+        <w:b w:val="0"/>
+        <w:i w:val="0"/>
+        <w:strike w:val="0"/>
+        <w:dstrike w:val="0"/>
+        <w:color w:val="14213D"/>
+        <w:sz w:val="20"/>
+        <w:szCs w:val="20"/>
+        <w:u w:val="none" w:color="000000"/>
+        <w:bdr w:val="none" w:sz="0" w:space="0" w:color="auto"/>
+        <w:shd w:val="clear" w:color="auto" w:fill="auto"/>
+        <w:vertAlign w:val="baseline"/>
+      </w:rPr>
+    </w:lvl>
+    <w:lvl w:ilvl="3" w:tplc="C648480C">
+      <w:start w:val="1"/>
+      <w:numFmt w:val="bullet"/>
+      <w:lvlText w:val="•"/>
+      <w:lvlJc w:val="left"/>
+      <w:pPr>
+        <w:ind w:left="2580"/>
+      </w:pPr>
+      <w:rPr>
+        <w:rFonts w:ascii="Arial" w:eastAsia="Arial" w:hAnsi="Arial" w:cs="Arial"/>
+        <w:b w:val="0"/>
+        <w:i w:val="0"/>
+        <w:strike w:val="0"/>
+        <w:dstrike w:val="0"/>
+        <w:color w:val="14213D"/>
+        <w:sz w:val="20"/>
+        <w:szCs w:val="20"/>
+        <w:u w:val="none" w:color="000000"/>
+        <w:bdr w:val="none" w:sz="0" w:space="0" w:color="auto"/>
+        <w:shd w:val="clear" w:color="auto" w:fill="auto"/>
+        <w:vertAlign w:val="baseline"/>
+      </w:rPr>
+    </w:lvl>
+    <w:lvl w:ilvl="4" w:tplc="48E8440A">
+      <w:start w:val="1"/>
+      <w:numFmt w:val="bullet"/>
+      <w:lvlText w:val="o"/>
+      <w:lvlJc w:val="left"/>
+      <w:pPr>
+        <w:ind w:left="3300"/>
+      </w:pPr>
+      <w:rPr>
+        <w:rFonts w:ascii="Arial" w:eastAsia="Arial" w:hAnsi="Arial" w:cs="Arial"/>
+        <w:b w:val="0"/>
+        <w:i w:val="0"/>
+        <w:strike w:val="0"/>
+        <w:dstrike w:val="0"/>
+        <w:color w:val="14213D"/>
+        <w:sz w:val="20"/>
+        <w:szCs w:val="20"/>
+        <w:u w:val="none" w:color="000000"/>
+        <w:bdr w:val="none" w:sz="0" w:space="0" w:color="auto"/>
+        <w:shd w:val="clear" w:color="auto" w:fill="auto"/>
+        <w:vertAlign w:val="baseline"/>
+      </w:rPr>
+    </w:lvl>
+    <w:lvl w:ilvl="5" w:tplc="C21AEEB2">
+      <w:start w:val="1"/>
+      <w:numFmt w:val="bullet"/>
+      <w:lvlText w:val="▪"/>
+      <w:lvlJc w:val="left"/>
+      <w:pPr>
+        <w:ind w:left="4020"/>
+      </w:pPr>
+      <w:rPr>
+        <w:rFonts w:ascii="Arial" w:eastAsia="Arial" w:hAnsi="Arial" w:cs="Arial"/>
+        <w:b w:val="0"/>
+        <w:i w:val="0"/>
+        <w:strike w:val="0"/>
+        <w:dstrike w:val="0"/>
+        <w:color w:val="14213D"/>
+        <w:sz w:val="20"/>
+        <w:szCs w:val="20"/>
+        <w:u w:val="none" w:color="000000"/>
+        <w:bdr w:val="none" w:sz="0" w:space="0" w:color="auto"/>
+        <w:shd w:val="clear" w:color="auto" w:fill="auto"/>
+        <w:vertAlign w:val="baseline"/>
+      </w:rPr>
+    </w:lvl>
+    <w:lvl w:ilvl="6" w:tplc="AF04BFC2">
+      <w:start w:val="1"/>
+      <w:numFmt w:val="bullet"/>
+      <w:lvlText w:val="•"/>
+      <w:lvlJc w:val="left"/>
+      <w:pPr>
+        <w:ind w:left="4740"/>
+      </w:pPr>
+      <w:rPr>
+        <w:rFonts w:ascii="Arial" w:eastAsia="Arial" w:hAnsi="Arial" w:cs="Arial"/>
+        <w:b w:val="0"/>
+        <w:i w:val="0"/>
+        <w:strike w:val="0"/>
+        <w:dstrike w:val="0"/>
+        <w:color w:val="14213D"/>
+        <w:sz w:val="20"/>
+        <w:szCs w:val="20"/>
+        <w:u w:val="none" w:color="000000"/>
+        <w:bdr w:val="none" w:sz="0" w:space="0" w:color="auto"/>
+        <w:shd w:val="clear" w:color="auto" w:fill="auto"/>
+        <w:vertAlign w:val="baseline"/>
+      </w:rPr>
+    </w:lvl>
+    <w:lvl w:ilvl="7" w:tplc="20D01CA0">
+      <w:start w:val="1"/>
+      <w:numFmt w:val="bullet"/>
+      <w:lvlText w:val="o"/>
+      <w:lvlJc w:val="left"/>
+      <w:pPr>
+        <w:ind w:left="5460"/>
+      </w:pPr>
+      <w:rPr>
+        <w:rFonts w:ascii="Arial" w:eastAsia="Arial" w:hAnsi="Arial" w:cs="Arial"/>
+        <w:b w:val="0"/>
+        <w:i w:val="0"/>
+        <w:strike w:val="0"/>
+        <w:dstrike w:val="0"/>
+        <w:color w:val="14213D"/>
+        <w:sz w:val="20"/>
+        <w:szCs w:val="20"/>
+        <w:u w:val="none" w:color="000000"/>
+        <w:bdr w:val="none" w:sz="0" w:space="0" w:color="auto"/>
+        <w:shd w:val="clear" w:color="auto" w:fill="auto"/>
+        <w:vertAlign w:val="baseline"/>
+      </w:rPr>
+    </w:lvl>
+    <w:lvl w:ilvl="8" w:tplc="9D18240E">
+      <w:start w:val="1"/>
+      <w:numFmt w:val="bullet"/>
+      <w:lvlText w:val="▪"/>
+      <w:lvlJc w:val="left"/>
+      <w:pPr>
+        <w:ind w:left="6180"/>
+      </w:pPr>
+      <w:rPr>
+        <w:rFonts w:ascii="Arial" w:eastAsia="Arial" w:hAnsi="Arial" w:cs="Arial"/>
+        <w:b w:val="0"/>
+        <w:i w:val="0"/>
+        <w:strike w:val="0"/>
+        <w:dstrike w:val="0"/>
+        <w:color w:val="14213D"/>
+        <w:sz w:val="20"/>
+        <w:szCs w:val="20"/>
+        <w:u w:val="none" w:color="000000"/>
+        <w:bdr w:val="none" w:sz="0" w:space="0" w:color="auto"/>
+        <w:shd w:val="clear" w:color="auto" w:fill="auto"/>
+        <w:vertAlign w:val="baseline"/>
+      </w:rPr>
+    </w:lvl>
+  </w:abstractNum>
+  <w:abstractNum w:abstractNumId="2" w15:restartNumberingAfterBreak="0">
+    <w:nsid w:val="0D692C5F"/>
+    <w:multiLevelType w:val="hybridMultilevel"/>
+    <w:tmpl w:val="FADE9972"/>
+    <w:lvl w:ilvl="0" w:tplc="28EAF684">
+      <w:start w:val="1"/>
+      <w:numFmt w:val="bullet"/>
+      <w:lvlText w:val="-"/>
+      <w:lvlJc w:val="left"/>
+      <w:pPr>
+        <w:ind w:left="265"/>
+      </w:pPr>
+      <w:rPr>
+        <w:rFonts w:ascii="Arial" w:eastAsia="Arial" w:hAnsi="Arial" w:cs="Arial"/>
+        <w:b w:val="0"/>
+        <w:i w:val="0"/>
+        <w:strike w:val="0"/>
+        <w:dstrike w:val="0"/>
+        <w:color w:val="14213D"/>
+        <w:sz w:val="20"/>
+        <w:szCs w:val="20"/>
+        <w:u w:val="none" w:color="000000"/>
+        <w:bdr w:val="none" w:sz="0" w:space="0" w:color="auto"/>
+        <w:shd w:val="clear" w:color="auto" w:fill="auto"/>
+        <w:vertAlign w:val="baseline"/>
+      </w:rPr>
+    </w:lvl>
+    <w:lvl w:ilvl="1" w:tplc="C994D0B4">
+      <w:start w:val="1"/>
+      <w:numFmt w:val="bullet"/>
+      <w:lvlText w:val="o"/>
+      <w:lvlJc w:val="left"/>
+      <w:pPr>
+        <w:ind w:left="1140"/>
+      </w:pPr>
+      <w:rPr>
+        <w:rFonts w:ascii="Arial" w:eastAsia="Arial" w:hAnsi="Arial" w:cs="Arial"/>
+        <w:b w:val="0"/>
+        <w:i w:val="0"/>
+        <w:strike w:val="0"/>
+        <w:dstrike w:val="0"/>
+        <w:color w:val="14213D"/>
+        <w:sz w:val="20"/>
+        <w:szCs w:val="20"/>
+        <w:u w:val="none" w:color="000000"/>
+        <w:bdr w:val="none" w:sz="0" w:space="0" w:color="auto"/>
+        <w:shd w:val="clear" w:color="auto" w:fill="auto"/>
+        <w:vertAlign w:val="baseline"/>
+      </w:rPr>
+    </w:lvl>
+    <w:lvl w:ilvl="2" w:tplc="497EEDC8">
+      <w:start w:val="1"/>
+      <w:numFmt w:val="bullet"/>
+      <w:lvlText w:val="▪"/>
+      <w:lvlJc w:val="left"/>
+      <w:pPr>
+        <w:ind w:left="1860"/>
+      </w:pPr>
+      <w:rPr>
+        <w:rFonts w:ascii="Arial" w:eastAsia="Arial" w:hAnsi="Arial" w:cs="Arial"/>
+        <w:b w:val="0"/>
+        <w:i w:val="0"/>
+        <w:strike w:val="0"/>
+        <w:dstrike w:val="0"/>
+        <w:color w:val="14213D"/>
+        <w:sz w:val="20"/>
+        <w:szCs w:val="20"/>
+        <w:u w:val="none" w:color="000000"/>
+        <w:bdr w:val="none" w:sz="0" w:space="0" w:color="auto"/>
+        <w:shd w:val="clear" w:color="auto" w:fill="auto"/>
+        <w:vertAlign w:val="baseline"/>
+      </w:rPr>
+    </w:lvl>
+    <w:lvl w:ilvl="3" w:tplc="A2C83B36">
+      <w:start w:val="1"/>
+      <w:numFmt w:val="bullet"/>
+      <w:lvlText w:val="•"/>
+      <w:lvlJc w:val="left"/>
+      <w:pPr>
+        <w:ind w:left="2580"/>
+      </w:pPr>
+      <w:rPr>
+        <w:rFonts w:ascii="Arial" w:eastAsia="Arial" w:hAnsi="Arial" w:cs="Arial"/>
+        <w:b w:val="0"/>
+        <w:i w:val="0"/>
+        <w:strike w:val="0"/>
+        <w:dstrike w:val="0"/>
+        <w:color w:val="14213D"/>
+        <w:sz w:val="20"/>
+        <w:szCs w:val="20"/>
+        <w:u w:val="none" w:color="000000"/>
+        <w:bdr w:val="none" w:sz="0" w:space="0" w:color="auto"/>
+        <w:shd w:val="clear" w:color="auto" w:fill="auto"/>
+        <w:vertAlign w:val="baseline"/>
+      </w:rPr>
+    </w:lvl>
+    <w:lvl w:ilvl="4" w:tplc="0BE47B16">
+      <w:start w:val="1"/>
+      <w:numFmt w:val="bullet"/>
+      <w:lvlText w:val="o"/>
+      <w:lvlJc w:val="left"/>
+      <w:pPr>
+        <w:ind w:left="3300"/>
+      </w:pPr>
+      <w:rPr>
+        <w:rFonts w:ascii="Arial" w:eastAsia="Arial" w:hAnsi="Arial" w:cs="Arial"/>
+        <w:b w:val="0"/>
+        <w:i w:val="0"/>
+        <w:strike w:val="0"/>
+        <w:dstrike w:val="0"/>
+        <w:color w:val="14213D"/>
+        <w:sz w:val="20"/>
+        <w:szCs w:val="20"/>
+        <w:u w:val="none" w:color="000000"/>
+        <w:bdr w:val="none" w:sz="0" w:space="0" w:color="auto"/>
+        <w:shd w:val="clear" w:color="auto" w:fill="auto"/>
+        <w:vertAlign w:val="baseline"/>
+      </w:rPr>
+    </w:lvl>
+    <w:lvl w:ilvl="5" w:tplc="9BC0B68A">
+      <w:start w:val="1"/>
+      <w:numFmt w:val="bullet"/>
+      <w:lvlText w:val="▪"/>
+      <w:lvlJc w:val="left"/>
+      <w:pPr>
+        <w:ind w:left="4020"/>
+      </w:pPr>
+      <w:rPr>
+        <w:rFonts w:ascii="Arial" w:eastAsia="Arial" w:hAnsi="Arial" w:cs="Arial"/>
+        <w:b w:val="0"/>
+        <w:i w:val="0"/>
+        <w:strike w:val="0"/>
+        <w:dstrike w:val="0"/>
+        <w:color w:val="14213D"/>
+        <w:sz w:val="20"/>
+        <w:szCs w:val="20"/>
+        <w:u w:val="none" w:color="000000"/>
+        <w:bdr w:val="none" w:sz="0" w:space="0" w:color="auto"/>
+        <w:shd w:val="clear" w:color="auto" w:fill="auto"/>
+        <w:vertAlign w:val="baseline"/>
+      </w:rPr>
+    </w:lvl>
+    <w:lvl w:ilvl="6" w:tplc="64382AFC">
+      <w:start w:val="1"/>
+      <w:numFmt w:val="bullet"/>
+      <w:lvlText w:val="•"/>
+      <w:lvlJc w:val="left"/>
+      <w:pPr>
+        <w:ind w:left="4740"/>
+      </w:pPr>
+      <w:rPr>
+        <w:rFonts w:ascii="Arial" w:eastAsia="Arial" w:hAnsi="Arial" w:cs="Arial"/>
+        <w:b w:val="0"/>
+        <w:i w:val="0"/>
+        <w:strike w:val="0"/>
+        <w:dstrike w:val="0"/>
+        <w:color w:val="14213D"/>
+        <w:sz w:val="20"/>
+        <w:szCs w:val="20"/>
+        <w:u w:val="none" w:color="000000"/>
+        <w:bdr w:val="none" w:sz="0" w:space="0" w:color="auto"/>
+        <w:shd w:val="clear" w:color="auto" w:fill="auto"/>
+        <w:vertAlign w:val="baseline"/>
+      </w:rPr>
+    </w:lvl>
+    <w:lvl w:ilvl="7" w:tplc="83F61D6A">
+      <w:start w:val="1"/>
+      <w:numFmt w:val="bullet"/>
+      <w:lvlText w:val="o"/>
+      <w:lvlJc w:val="left"/>
+      <w:pPr>
+        <w:ind w:left="5460"/>
+      </w:pPr>
+      <w:rPr>
+        <w:rFonts w:ascii="Arial" w:eastAsia="Arial" w:hAnsi="Arial" w:cs="Arial"/>
+        <w:b w:val="0"/>
+        <w:i w:val="0"/>
+        <w:strike w:val="0"/>
+        <w:dstrike w:val="0"/>
+        <w:color w:val="14213D"/>
+        <w:sz w:val="20"/>
+        <w:szCs w:val="20"/>
+        <w:u w:val="none" w:color="000000"/>
+        <w:bdr w:val="none" w:sz="0" w:space="0" w:color="auto"/>
+        <w:shd w:val="clear" w:color="auto" w:fill="auto"/>
+        <w:vertAlign w:val="baseline"/>
+      </w:rPr>
+    </w:lvl>
+    <w:lvl w:ilvl="8" w:tplc="F52E7516">
+      <w:start w:val="1"/>
+      <w:numFmt w:val="bullet"/>
+      <w:lvlText w:val="▪"/>
+      <w:lvlJc w:val="left"/>
+      <w:pPr>
+        <w:ind w:left="6180"/>
+      </w:pPr>
+      <w:rPr>
+        <w:rFonts w:ascii="Arial" w:eastAsia="Arial" w:hAnsi="Arial" w:cs="Arial"/>
+        <w:b w:val="0"/>
+        <w:i w:val="0"/>
+        <w:strike w:val="0"/>
+        <w:dstrike w:val="0"/>
+        <w:color w:val="14213D"/>
+        <w:sz w:val="20"/>
+        <w:szCs w:val="20"/>
+        <w:u w:val="none" w:color="000000"/>
+        <w:bdr w:val="none" w:sz="0" w:space="0" w:color="auto"/>
+        <w:shd w:val="clear" w:color="auto" w:fill="auto"/>
+        <w:vertAlign w:val="baseline"/>
+      </w:rPr>
+    </w:lvl>
+  </w:abstractNum>
+  <w:abstractNum w:abstractNumId="3" w15:restartNumberingAfterBreak="0">
+    <w:nsid w:val="17E02FFC"/>
+    <w:multiLevelType w:val="hybridMultilevel"/>
+    <w:tmpl w:val="401A82F0"/>
+    <w:lvl w:ilvl="0" w:tplc="A5D6AAF2">
+      <w:start w:val="8"/>
       <w:numFmt w:val="decimal"/>
       <w:lvlText w:val="%1."/>
       <w:lvlJc w:val="left"/>
       <w:pPr>
-        <w:ind w:left="384"/>
+        <w:ind w:left="512"/>
       </w:pPr>
       <w:rPr>
         <w:rFonts w:ascii="Arial" w:eastAsia="Arial" w:hAnsi="Arial" w:cs="Arial"/>
@@ -7058,7 +7661,7 @@
         <w:vertAlign w:val="baseline"/>
       </w:rPr>
     </w:lvl>
-    <w:lvl w:ilvl="1" w:tplc="9086D390">
+    <w:lvl w:ilvl="1" w:tplc="90989DC2">
       <w:start w:val="1"/>
       <w:numFmt w:val="lowerLetter"/>
       <w:lvlText w:val="%2"/>
@@ -7081,7 +7684,7 @@
         <w:vertAlign w:val="baseline"/>
       </w:rPr>
     </w:lvl>
-    <w:lvl w:ilvl="2" w:tplc="FB6E5BBC">
+    <w:lvl w:ilvl="2" w:tplc="B58AE006">
       <w:start w:val="1"/>
       <w:numFmt w:val="lowerRoman"/>
       <w:lvlText w:val="%3"/>
@@ -7104,7 +7707,7 @@
         <w:vertAlign w:val="baseline"/>
       </w:rPr>
     </w:lvl>
-    <w:lvl w:ilvl="3" w:tplc="CB261192">
+    <w:lvl w:ilvl="3" w:tplc="CD3AE0D4">
       <w:start w:val="1"/>
       <w:numFmt w:val="decimal"/>
       <w:lvlText w:val="%4"/>
@@ -7127,7 +7730,7 @@
         <w:vertAlign w:val="baseline"/>
       </w:rPr>
     </w:lvl>
-    <w:lvl w:ilvl="4" w:tplc="68E6BA74">
+    <w:lvl w:ilvl="4" w:tplc="BF5CBC0A">
       <w:start w:val="1"/>
       <w:numFmt w:val="lowerLetter"/>
       <w:lvlText w:val="%5"/>
@@ -7150,7 +7753,7 @@
         <w:vertAlign w:val="baseline"/>
       </w:rPr>
     </w:lvl>
-    <w:lvl w:ilvl="5" w:tplc="9DDEBEF8">
+    <w:lvl w:ilvl="5" w:tplc="732E1056">
       <w:start w:val="1"/>
       <w:numFmt w:val="lowerRoman"/>
       <w:lvlText w:val="%6"/>
@@ -7173,7 +7776,7 @@
         <w:vertAlign w:val="baseline"/>
       </w:rPr>
     </w:lvl>
-    <w:lvl w:ilvl="6" w:tplc="DD188C52">
+    <w:lvl w:ilvl="6" w:tplc="3714484E">
       <w:start w:val="1"/>
       <w:numFmt w:val="decimal"/>
       <w:lvlText w:val="%7"/>
@@ -7196,7 +7799,7 @@
         <w:vertAlign w:val="baseline"/>
       </w:rPr>
     </w:lvl>
-    <w:lvl w:ilvl="7" w:tplc="9ABE16A2">
+    <w:lvl w:ilvl="7" w:tplc="4B7EB9D0">
       <w:start w:val="1"/>
       <w:numFmt w:val="lowerLetter"/>
       <w:lvlText w:val="%8"/>
@@ -7219,7 +7822,7 @@
         <w:vertAlign w:val="baseline"/>
       </w:rPr>
     </w:lvl>
-    <w:lvl w:ilvl="8" w:tplc="BB2AEAEE">
+    <w:lvl w:ilvl="8" w:tplc="D88AC5CE">
       <w:start w:val="1"/>
       <w:numFmt w:val="lowerRoman"/>
       <w:lvlText w:val="%9"/>
@@ -7243,11 +7846,11 @@
       </w:rPr>
     </w:lvl>
   </w:abstractNum>
-  <w:abstractNum w:abstractNumId="1" w15:restartNumberingAfterBreak="0">
-    <w:nsid w:val="0A2F6B5B"/>
+  <w:abstractNum w:abstractNumId="4" w15:restartNumberingAfterBreak="0">
+    <w:nsid w:val="23325B3D"/>
     <w:multiLevelType w:val="hybridMultilevel"/>
-    <w:tmpl w:val="9DD6806A"/>
-    <w:lvl w:ilvl="0" w:tplc="E578ECA6">
+    <w:tmpl w:val="14CC3DC8"/>
+    <w:lvl w:ilvl="0" w:tplc="7D1CFDF0">
       <w:start w:val="1"/>
       <w:numFmt w:val="bullet"/>
       <w:lvlText w:val="-"/>
@@ -7270,7 +7873,7 @@
         <w:vertAlign w:val="baseline"/>
       </w:rPr>
     </w:lvl>
-    <w:lvl w:ilvl="1" w:tplc="359058AE">
+    <w:lvl w:ilvl="1" w:tplc="89506C02">
       <w:start w:val="1"/>
       <w:numFmt w:val="bullet"/>
       <w:lvlText w:val="o"/>
@@ -7293,7 +7896,7 @@
         <w:vertAlign w:val="baseline"/>
       </w:rPr>
     </w:lvl>
-    <w:lvl w:ilvl="2" w:tplc="A474A24C">
+    <w:lvl w:ilvl="2" w:tplc="FC74A432">
       <w:start w:val="1"/>
       <w:numFmt w:val="bullet"/>
       <w:lvlText w:val="▪"/>
@@ -7316,7 +7919,7 @@
         <w:vertAlign w:val="baseline"/>
       </w:rPr>
     </w:lvl>
-    <w:lvl w:ilvl="3" w:tplc="BCB4EB26">
+    <w:lvl w:ilvl="3" w:tplc="A4F614E8">
       <w:start w:val="1"/>
       <w:numFmt w:val="bullet"/>
       <w:lvlText w:val="•"/>
@@ -7339,7 +7942,7 @@
         <w:vertAlign w:val="baseline"/>
       </w:rPr>
     </w:lvl>
-    <w:lvl w:ilvl="4" w:tplc="CD4A3284">
+    <w:lvl w:ilvl="4" w:tplc="88882BCE">
       <w:start w:val="1"/>
       <w:numFmt w:val="bullet"/>
       <w:lvlText w:val="o"/>
@@ -7362,7 +7965,7 @@
         <w:vertAlign w:val="baseline"/>
       </w:rPr>
     </w:lvl>
-    <w:lvl w:ilvl="5" w:tplc="5DD4E0FA">
+    <w:lvl w:ilvl="5" w:tplc="E93C30C4">
       <w:start w:val="1"/>
       <w:numFmt w:val="bullet"/>
       <w:lvlText w:val="▪"/>
@@ -7385,7 +7988,7 @@
         <w:vertAlign w:val="baseline"/>
       </w:rPr>
     </w:lvl>
-    <w:lvl w:ilvl="6" w:tplc="5E741A74">
+    <w:lvl w:ilvl="6" w:tplc="5D3A0F5A">
       <w:start w:val="1"/>
       <w:numFmt w:val="bullet"/>
       <w:lvlText w:val="•"/>
@@ -7408,7 +8011,7 @@
         <w:vertAlign w:val="baseline"/>
       </w:rPr>
     </w:lvl>
-    <w:lvl w:ilvl="7" w:tplc="514EA72C">
+    <w:lvl w:ilvl="7" w:tplc="2F0ADA4C">
       <w:start w:val="1"/>
       <w:numFmt w:val="bullet"/>
       <w:lvlText w:val="o"/>
@@ -7431,7 +8034,7 @@
         <w:vertAlign w:val="baseline"/>
       </w:rPr>
     </w:lvl>
-    <w:lvl w:ilvl="8" w:tplc="AED8125A">
+    <w:lvl w:ilvl="8" w:tplc="2144B27E">
       <w:start w:val="1"/>
       <w:numFmt w:val="bullet"/>
       <w:lvlText w:val="▪"/>
@@ -7455,17 +8058,17 @@
       </w:rPr>
     </w:lvl>
   </w:abstractNum>
-  <w:abstractNum w:abstractNumId="2" w15:restartNumberingAfterBreak="0">
-    <w:nsid w:val="12B3044B"/>
+  <w:abstractNum w:abstractNumId="5" w15:restartNumberingAfterBreak="0">
+    <w:nsid w:val="31C936CC"/>
     <w:multiLevelType w:val="hybridMultilevel"/>
-    <w:tmpl w:val="BAA8746A"/>
-    <w:lvl w:ilvl="0" w:tplc="8C029188">
+    <w:tmpl w:val="01AC9BB8"/>
+    <w:lvl w:ilvl="0" w:tplc="75CEC220">
       <w:start w:val="1"/>
       <w:numFmt w:val="bullet"/>
       <w:lvlText w:val="-"/>
       <w:lvlJc w:val="left"/>
       <w:pPr>
-        <w:ind w:left="265"/>
+        <w:ind w:left="220"/>
       </w:pPr>
       <w:rPr>
         <w:rFonts w:ascii="Arial" w:eastAsia="Arial" w:hAnsi="Arial" w:cs="Arial"/>
@@ -7482,7 +8085,7 @@
         <w:vertAlign w:val="baseline"/>
       </w:rPr>
     </w:lvl>
-    <w:lvl w:ilvl="1" w:tplc="BBEE5342">
+    <w:lvl w:ilvl="1" w:tplc="DFE61A84">
       <w:start w:val="1"/>
       <w:numFmt w:val="bullet"/>
       <w:lvlText w:val="o"/>
@@ -7505,7 +8108,7 @@
         <w:vertAlign w:val="baseline"/>
       </w:rPr>
     </w:lvl>
-    <w:lvl w:ilvl="2" w:tplc="9DF89C9A">
+    <w:lvl w:ilvl="2" w:tplc="8E524B44">
       <w:start w:val="1"/>
       <w:numFmt w:val="bullet"/>
       <w:lvlText w:val="▪"/>
@@ -7528,7 +8131,7 @@
         <w:vertAlign w:val="baseline"/>
       </w:rPr>
     </w:lvl>
-    <w:lvl w:ilvl="3" w:tplc="55B8C982">
+    <w:lvl w:ilvl="3" w:tplc="C4F8E3BA">
       <w:start w:val="1"/>
       <w:numFmt w:val="bullet"/>
       <w:lvlText w:val="•"/>
@@ -7551,7 +8154,7 @@
         <w:vertAlign w:val="baseline"/>
       </w:rPr>
     </w:lvl>
-    <w:lvl w:ilvl="4" w:tplc="0236386A">
+    <w:lvl w:ilvl="4" w:tplc="DF66CE72">
       <w:start w:val="1"/>
       <w:numFmt w:val="bullet"/>
       <w:lvlText w:val="o"/>
@@ -7574,7 +8177,7 @@
         <w:vertAlign w:val="baseline"/>
       </w:rPr>
     </w:lvl>
-    <w:lvl w:ilvl="5" w:tplc="879C1248">
+    <w:lvl w:ilvl="5" w:tplc="87BCDE1E">
       <w:start w:val="1"/>
       <w:numFmt w:val="bullet"/>
       <w:lvlText w:val="▪"/>
@@ -7597,7 +8200,7 @@
         <w:vertAlign w:val="baseline"/>
       </w:rPr>
     </w:lvl>
-    <w:lvl w:ilvl="6" w:tplc="D0F4CBDA">
+    <w:lvl w:ilvl="6" w:tplc="B38EFE4C">
       <w:start w:val="1"/>
       <w:numFmt w:val="bullet"/>
       <w:lvlText w:val="•"/>
@@ -7620,7 +8223,7 @@
         <w:vertAlign w:val="baseline"/>
       </w:rPr>
     </w:lvl>
-    <w:lvl w:ilvl="7" w:tplc="DF566AF8">
+    <w:lvl w:ilvl="7" w:tplc="50867FC0">
       <w:start w:val="1"/>
       <w:numFmt w:val="bullet"/>
       <w:lvlText w:val="o"/>
@@ -7643,7 +8246,7 @@
         <w:vertAlign w:val="baseline"/>
       </w:rPr>
     </w:lvl>
-    <w:lvl w:ilvl="8" w:tplc="283AB1FA">
+    <w:lvl w:ilvl="8" w:tplc="8156421A">
       <w:start w:val="1"/>
       <w:numFmt w:val="bullet"/>
       <w:lvlText w:val="▪"/>
@@ -7667,17 +8270,229 @@
       </w:rPr>
     </w:lvl>
   </w:abstractNum>
-  <w:abstractNum w:abstractNumId="3" w15:restartNumberingAfterBreak="0">
-    <w:nsid w:val="1D6554A6"/>
+  <w:abstractNum w:abstractNumId="6" w15:restartNumberingAfterBreak="0">
+    <w:nsid w:val="3A0055FC"/>
     <w:multiLevelType w:val="hybridMultilevel"/>
-    <w:tmpl w:val="64269EAE"/>
-    <w:lvl w:ilvl="0" w:tplc="0AD0072C">
-      <w:start w:val="8"/>
+    <w:tmpl w:val="C41E6450"/>
+    <w:lvl w:ilvl="0" w:tplc="D294386E">
+      <w:start w:val="1"/>
+      <w:numFmt w:val="bullet"/>
+      <w:lvlText w:val="-"/>
+      <w:lvlJc w:val="left"/>
+      <w:pPr>
+        <w:ind w:left="220"/>
+      </w:pPr>
+      <w:rPr>
+        <w:rFonts w:ascii="Arial" w:eastAsia="Arial" w:hAnsi="Arial" w:cs="Arial"/>
+        <w:b w:val="0"/>
+        <w:i w:val="0"/>
+        <w:strike w:val="0"/>
+        <w:dstrike w:val="0"/>
+        <w:color w:val="14213D"/>
+        <w:sz w:val="20"/>
+        <w:szCs w:val="20"/>
+        <w:u w:val="none" w:color="000000"/>
+        <w:bdr w:val="none" w:sz="0" w:space="0" w:color="auto"/>
+        <w:shd w:val="clear" w:color="auto" w:fill="auto"/>
+        <w:vertAlign w:val="baseline"/>
+      </w:rPr>
+    </w:lvl>
+    <w:lvl w:ilvl="1" w:tplc="5D867252">
+      <w:start w:val="1"/>
+      <w:numFmt w:val="bullet"/>
+      <w:lvlText w:val="o"/>
+      <w:lvlJc w:val="left"/>
+      <w:pPr>
+        <w:ind w:left="1140"/>
+      </w:pPr>
+      <w:rPr>
+        <w:rFonts w:ascii="Arial" w:eastAsia="Arial" w:hAnsi="Arial" w:cs="Arial"/>
+        <w:b w:val="0"/>
+        <w:i w:val="0"/>
+        <w:strike w:val="0"/>
+        <w:dstrike w:val="0"/>
+        <w:color w:val="14213D"/>
+        <w:sz w:val="20"/>
+        <w:szCs w:val="20"/>
+        <w:u w:val="none" w:color="000000"/>
+        <w:bdr w:val="none" w:sz="0" w:space="0" w:color="auto"/>
+        <w:shd w:val="clear" w:color="auto" w:fill="auto"/>
+        <w:vertAlign w:val="baseline"/>
+      </w:rPr>
+    </w:lvl>
+    <w:lvl w:ilvl="2" w:tplc="3AAEAA06">
+      <w:start w:val="1"/>
+      <w:numFmt w:val="bullet"/>
+      <w:lvlText w:val="▪"/>
+      <w:lvlJc w:val="left"/>
+      <w:pPr>
+        <w:ind w:left="1860"/>
+      </w:pPr>
+      <w:rPr>
+        <w:rFonts w:ascii="Arial" w:eastAsia="Arial" w:hAnsi="Arial" w:cs="Arial"/>
+        <w:b w:val="0"/>
+        <w:i w:val="0"/>
+        <w:strike w:val="0"/>
+        <w:dstrike w:val="0"/>
+        <w:color w:val="14213D"/>
+        <w:sz w:val="20"/>
+        <w:szCs w:val="20"/>
+        <w:u w:val="none" w:color="000000"/>
+        <w:bdr w:val="none" w:sz="0" w:space="0" w:color="auto"/>
+        <w:shd w:val="clear" w:color="auto" w:fill="auto"/>
+        <w:vertAlign w:val="baseline"/>
+      </w:rPr>
+    </w:lvl>
+    <w:lvl w:ilvl="3" w:tplc="4D7C0DAC">
+      <w:start w:val="1"/>
+      <w:numFmt w:val="bullet"/>
+      <w:lvlText w:val="•"/>
+      <w:lvlJc w:val="left"/>
+      <w:pPr>
+        <w:ind w:left="2580"/>
+      </w:pPr>
+      <w:rPr>
+        <w:rFonts w:ascii="Arial" w:eastAsia="Arial" w:hAnsi="Arial" w:cs="Arial"/>
+        <w:b w:val="0"/>
+        <w:i w:val="0"/>
+        <w:strike w:val="0"/>
+        <w:dstrike w:val="0"/>
+        <w:color w:val="14213D"/>
+        <w:sz w:val="20"/>
+        <w:szCs w:val="20"/>
+        <w:u w:val="none" w:color="000000"/>
+        <w:bdr w:val="none" w:sz="0" w:space="0" w:color="auto"/>
+        <w:shd w:val="clear" w:color="auto" w:fill="auto"/>
+        <w:vertAlign w:val="baseline"/>
+      </w:rPr>
+    </w:lvl>
+    <w:lvl w:ilvl="4" w:tplc="039255C6">
+      <w:start w:val="1"/>
+      <w:numFmt w:val="bullet"/>
+      <w:lvlText w:val="o"/>
+      <w:lvlJc w:val="left"/>
+      <w:pPr>
+        <w:ind w:left="3300"/>
+      </w:pPr>
+      <w:rPr>
+        <w:rFonts w:ascii="Arial" w:eastAsia="Arial" w:hAnsi="Arial" w:cs="Arial"/>
+        <w:b w:val="0"/>
+        <w:i w:val="0"/>
+        <w:strike w:val="0"/>
+        <w:dstrike w:val="0"/>
+        <w:color w:val="14213D"/>
+        <w:sz w:val="20"/>
+        <w:szCs w:val="20"/>
+        <w:u w:val="none" w:color="000000"/>
+        <w:bdr w:val="none" w:sz="0" w:space="0" w:color="auto"/>
+        <w:shd w:val="clear" w:color="auto" w:fill="auto"/>
+        <w:vertAlign w:val="baseline"/>
+      </w:rPr>
+    </w:lvl>
+    <w:lvl w:ilvl="5" w:tplc="E6643AA6">
+      <w:start w:val="1"/>
+      <w:numFmt w:val="bullet"/>
+      <w:lvlText w:val="▪"/>
+      <w:lvlJc w:val="left"/>
+      <w:pPr>
+        <w:ind w:left="4020"/>
+      </w:pPr>
+      <w:rPr>
+        <w:rFonts w:ascii="Arial" w:eastAsia="Arial" w:hAnsi="Arial" w:cs="Arial"/>
+        <w:b w:val="0"/>
+        <w:i w:val="0"/>
+        <w:strike w:val="0"/>
+        <w:dstrike w:val="0"/>
+        <w:color w:val="14213D"/>
+        <w:sz w:val="20"/>
+        <w:szCs w:val="20"/>
+        <w:u w:val="none" w:color="000000"/>
+        <w:bdr w:val="none" w:sz="0" w:space="0" w:color="auto"/>
+        <w:shd w:val="clear" w:color="auto" w:fill="auto"/>
+        <w:vertAlign w:val="baseline"/>
+      </w:rPr>
+    </w:lvl>
+    <w:lvl w:ilvl="6" w:tplc="4CBC20F4">
+      <w:start w:val="1"/>
+      <w:numFmt w:val="bullet"/>
+      <w:lvlText w:val="•"/>
+      <w:lvlJc w:val="left"/>
+      <w:pPr>
+        <w:ind w:left="4740"/>
+      </w:pPr>
+      <w:rPr>
+        <w:rFonts w:ascii="Arial" w:eastAsia="Arial" w:hAnsi="Arial" w:cs="Arial"/>
+        <w:b w:val="0"/>
+        <w:i w:val="0"/>
+        <w:strike w:val="0"/>
+        <w:dstrike w:val="0"/>
+        <w:color w:val="14213D"/>
+        <w:sz w:val="20"/>
+        <w:szCs w:val="20"/>
+        <w:u w:val="none" w:color="000000"/>
+        <w:bdr w:val="none" w:sz="0" w:space="0" w:color="auto"/>
+        <w:shd w:val="clear" w:color="auto" w:fill="auto"/>
+        <w:vertAlign w:val="baseline"/>
+      </w:rPr>
+    </w:lvl>
+    <w:lvl w:ilvl="7" w:tplc="B02C31D2">
+      <w:start w:val="1"/>
+      <w:numFmt w:val="bullet"/>
+      <w:lvlText w:val="o"/>
+      <w:lvlJc w:val="left"/>
+      <w:pPr>
+        <w:ind w:left="5460"/>
+      </w:pPr>
+      <w:rPr>
+        <w:rFonts w:ascii="Arial" w:eastAsia="Arial" w:hAnsi="Arial" w:cs="Arial"/>
+        <w:b w:val="0"/>
+        <w:i w:val="0"/>
+        <w:strike w:val="0"/>
+        <w:dstrike w:val="0"/>
+        <w:color w:val="14213D"/>
+        <w:sz w:val="20"/>
+        <w:szCs w:val="20"/>
+        <w:u w:val="none" w:color="000000"/>
+        <w:bdr w:val="none" w:sz="0" w:space="0" w:color="auto"/>
+        <w:shd w:val="clear" w:color="auto" w:fill="auto"/>
+        <w:vertAlign w:val="baseline"/>
+      </w:rPr>
+    </w:lvl>
+    <w:lvl w:ilvl="8" w:tplc="D206BE10">
+      <w:start w:val="1"/>
+      <w:numFmt w:val="bullet"/>
+      <w:lvlText w:val="▪"/>
+      <w:lvlJc w:val="left"/>
+      <w:pPr>
+        <w:ind w:left="6180"/>
+      </w:pPr>
+      <w:rPr>
+        <w:rFonts w:ascii="Arial" w:eastAsia="Arial" w:hAnsi="Arial" w:cs="Arial"/>
+        <w:b w:val="0"/>
+        <w:i w:val="0"/>
+        <w:strike w:val="0"/>
+        <w:dstrike w:val="0"/>
+        <w:color w:val="14213D"/>
+        <w:sz w:val="20"/>
+        <w:szCs w:val="20"/>
+        <w:u w:val="none" w:color="000000"/>
+        <w:bdr w:val="none" w:sz="0" w:space="0" w:color="auto"/>
+        <w:shd w:val="clear" w:color="auto" w:fill="auto"/>
+        <w:vertAlign w:val="baseline"/>
+      </w:rPr>
+    </w:lvl>
+  </w:abstractNum>
+  <w:abstractNum w:abstractNumId="7" w15:restartNumberingAfterBreak="0">
+    <w:nsid w:val="44430130"/>
+    <w:multiLevelType w:val="hybridMultilevel"/>
+    <w:tmpl w:val="59047DAC"/>
+    <w:lvl w:ilvl="0" w:tplc="9880E628">
+      <w:start w:val="3"/>
       <w:numFmt w:val="decimal"/>
       <w:lvlText w:val="%1."/>
       <w:lvlJc w:val="left"/>
       <w:pPr>
-        <w:ind w:left="512"/>
+        <w:ind w:left="384"/>
       </w:pPr>
       <w:rPr>
         <w:rFonts w:ascii="Arial" w:eastAsia="Arial" w:hAnsi="Arial" w:cs="Arial"/>
@@ -7694,7 +8509,7 @@
         <w:vertAlign w:val="baseline"/>
       </w:rPr>
     </w:lvl>
-    <w:lvl w:ilvl="1" w:tplc="836AE470">
+    <w:lvl w:ilvl="1" w:tplc="0C3A8356">
       <w:start w:val="1"/>
       <w:numFmt w:val="lowerLetter"/>
       <w:lvlText w:val="%2"/>
@@ -7717,7 +8532,7 @@
         <w:vertAlign w:val="baseline"/>
       </w:rPr>
     </w:lvl>
-    <w:lvl w:ilvl="2" w:tplc="4E0EC49A">
+    <w:lvl w:ilvl="2" w:tplc="DA0E0D30">
       <w:start w:val="1"/>
       <w:numFmt w:val="lowerRoman"/>
       <w:lvlText w:val="%3"/>
@@ -7740,7 +8555,7 @@
         <w:vertAlign w:val="baseline"/>
       </w:rPr>
     </w:lvl>
-    <w:lvl w:ilvl="3" w:tplc="F3300E78">
+    <w:lvl w:ilvl="3" w:tplc="5A086678">
       <w:start w:val="1"/>
       <w:numFmt w:val="decimal"/>
       <w:lvlText w:val="%4"/>
@@ -7763,7 +8578,7 @@
         <w:vertAlign w:val="baseline"/>
       </w:rPr>
     </w:lvl>
-    <w:lvl w:ilvl="4" w:tplc="94E0BBD6">
+    <w:lvl w:ilvl="4" w:tplc="A4A03D54">
       <w:start w:val="1"/>
       <w:numFmt w:val="lowerLetter"/>
       <w:lvlText w:val="%5"/>
@@ -7786,7 +8601,7 @@
         <w:vertAlign w:val="baseline"/>
       </w:rPr>
     </w:lvl>
-    <w:lvl w:ilvl="5" w:tplc="90628738">
+    <w:lvl w:ilvl="5" w:tplc="1C5E9BBE">
       <w:start w:val="1"/>
       <w:numFmt w:val="lowerRoman"/>
       <w:lvlText w:val="%6"/>
@@ -7809,7 +8624,7 @@
         <w:vertAlign w:val="baseline"/>
       </w:rPr>
     </w:lvl>
-    <w:lvl w:ilvl="6" w:tplc="D70EE3E8">
+    <w:lvl w:ilvl="6" w:tplc="67CED936">
       <w:start w:val="1"/>
       <w:numFmt w:val="decimal"/>
       <w:lvlText w:val="%7"/>
@@ -7832,7 +8647,7 @@
         <w:vertAlign w:val="baseline"/>
       </w:rPr>
     </w:lvl>
-    <w:lvl w:ilvl="7" w:tplc="C2446040">
+    <w:lvl w:ilvl="7" w:tplc="87AA1C2C">
       <w:start w:val="1"/>
       <w:numFmt w:val="lowerLetter"/>
       <w:lvlText w:val="%8"/>
@@ -7855,7 +8670,7 @@
         <w:vertAlign w:val="baseline"/>
       </w:rPr>
     </w:lvl>
-    <w:lvl w:ilvl="8" w:tplc="D4FC4EF0">
+    <w:lvl w:ilvl="8" w:tplc="3A6A5DDC">
       <w:start w:val="1"/>
       <w:numFmt w:val="lowerRoman"/>
       <w:lvlText w:val="%9"/>
@@ -7879,211 +8694,211 @@
       </w:rPr>
     </w:lvl>
   </w:abstractNum>
-  <w:abstractNum w:abstractNumId="4" w15:restartNumberingAfterBreak="0">
-    <w:nsid w:val="24C6096B"/>
+  <w:abstractNum w:abstractNumId="8" w15:restartNumberingAfterBreak="0">
+    <w:nsid w:val="5193326C"/>
     <w:multiLevelType w:val="hybridMultilevel"/>
-    <w:tmpl w:val="05F4DF54"/>
-    <w:lvl w:ilvl="0" w:tplc="5E962184">
+    <w:tmpl w:val="30C09C1A"/>
+    <w:lvl w:ilvl="0" w:tplc="35601EA6">
       <w:start w:val="1"/>
-      <w:numFmt w:val="bullet"/>
-      <w:lvlText w:val="-"/>
+      <w:numFmt w:val="decimal"/>
+      <w:lvlText w:val="%1."/>
       <w:lvlJc w:val="left"/>
       <w:pPr>
-        <w:ind w:left="220"/>
-      </w:pPr>
-      <w:rPr>
-        <w:rFonts w:ascii="Arial" w:eastAsia="Arial" w:hAnsi="Arial" w:cs="Arial"/>
+        <w:ind w:left="347"/>
+      </w:pPr>
+      <w:rPr>
+        <w:rFonts w:ascii="Courier New" w:eastAsia="Courier New" w:hAnsi="Courier New" w:cs="Courier New"/>
         <w:b w:val="0"/>
         <w:i w:val="0"/>
         <w:strike w:val="0"/>
         <w:dstrike w:val="0"/>
         <w:color w:val="14213D"/>
-        <w:sz w:val="20"/>
-        <w:szCs w:val="20"/>
+        <w:sz w:val="17"/>
+        <w:szCs w:val="17"/>
         <w:u w:val="none" w:color="000000"/>
         <w:bdr w:val="none" w:sz="0" w:space="0" w:color="auto"/>
         <w:shd w:val="clear" w:color="auto" w:fill="auto"/>
         <w:vertAlign w:val="baseline"/>
       </w:rPr>
     </w:lvl>
-    <w:lvl w:ilvl="1" w:tplc="124C73DE">
+    <w:lvl w:ilvl="1" w:tplc="07FC8C96">
       <w:start w:val="1"/>
-      <w:numFmt w:val="bullet"/>
-      <w:lvlText w:val="o"/>
+      <w:numFmt w:val="lowerLetter"/>
+      <w:lvlText w:val="%2"/>
       <w:lvlJc w:val="left"/>
       <w:pPr>
         <w:ind w:left="1140"/>
       </w:pPr>
       <w:rPr>
-        <w:rFonts w:ascii="Arial" w:eastAsia="Arial" w:hAnsi="Arial" w:cs="Arial"/>
+        <w:rFonts w:ascii="Courier New" w:eastAsia="Courier New" w:hAnsi="Courier New" w:cs="Courier New"/>
         <w:b w:val="0"/>
         <w:i w:val="0"/>
         <w:strike w:val="0"/>
         <w:dstrike w:val="0"/>
         <w:color w:val="14213D"/>
-        <w:sz w:val="20"/>
-        <w:szCs w:val="20"/>
+        <w:sz w:val="17"/>
+        <w:szCs w:val="17"/>
         <w:u w:val="none" w:color="000000"/>
         <w:bdr w:val="none" w:sz="0" w:space="0" w:color="auto"/>
         <w:shd w:val="clear" w:color="auto" w:fill="auto"/>
         <w:vertAlign w:val="baseline"/>
       </w:rPr>
     </w:lvl>
-    <w:lvl w:ilvl="2" w:tplc="82D83CC6">
+    <w:lvl w:ilvl="2" w:tplc="F6C6BBC4">
       <w:start w:val="1"/>
-      <w:numFmt w:val="bullet"/>
-      <w:lvlText w:val="▪"/>
+      <w:numFmt w:val="lowerRoman"/>
+      <w:lvlText w:val="%3"/>
       <w:lvlJc w:val="left"/>
       <w:pPr>
         <w:ind w:left="1860"/>
       </w:pPr>
       <w:rPr>
-        <w:rFonts w:ascii="Arial" w:eastAsia="Arial" w:hAnsi="Arial" w:cs="Arial"/>
+        <w:rFonts w:ascii="Courier New" w:eastAsia="Courier New" w:hAnsi="Courier New" w:cs="Courier New"/>
         <w:b w:val="0"/>
         <w:i w:val="0"/>
         <w:strike w:val="0"/>
         <w:dstrike w:val="0"/>
         <w:color w:val="14213D"/>
-        <w:sz w:val="20"/>
-        <w:szCs w:val="20"/>
+        <w:sz w:val="17"/>
+        <w:szCs w:val="17"/>
         <w:u w:val="none" w:color="000000"/>
         <w:bdr w:val="none" w:sz="0" w:space="0" w:color="auto"/>
         <w:shd w:val="clear" w:color="auto" w:fill="auto"/>
         <w:vertAlign w:val="baseline"/>
       </w:rPr>
     </w:lvl>
-    <w:lvl w:ilvl="3" w:tplc="E8C6825C">
+    <w:lvl w:ilvl="3" w:tplc="F3B05376">
       <w:start w:val="1"/>
-      <w:numFmt w:val="bullet"/>
-      <w:lvlText w:val="•"/>
+      <w:numFmt w:val="decimal"/>
+      <w:lvlText w:val="%4"/>
       <w:lvlJc w:val="left"/>
       <w:pPr>
         <w:ind w:left="2580"/>
       </w:pPr>
       <w:rPr>
-        <w:rFonts w:ascii="Arial" w:eastAsia="Arial" w:hAnsi="Arial" w:cs="Arial"/>
+        <w:rFonts w:ascii="Courier New" w:eastAsia="Courier New" w:hAnsi="Courier New" w:cs="Courier New"/>
         <w:b w:val="0"/>
         <w:i w:val="0"/>
         <w:strike w:val="0"/>
         <w:dstrike w:val="0"/>
         <w:color w:val="14213D"/>
-        <w:sz w:val="20"/>
-        <w:szCs w:val="20"/>
+        <w:sz w:val="17"/>
+        <w:szCs w:val="17"/>
         <w:u w:val="none" w:color="000000"/>
         <w:bdr w:val="none" w:sz="0" w:space="0" w:color="auto"/>
         <w:shd w:val="clear" w:color="auto" w:fill="auto"/>
         <w:vertAlign w:val="baseline"/>
       </w:rPr>
     </w:lvl>
-    <w:lvl w:ilvl="4" w:tplc="98CE8F6C">
+    <w:lvl w:ilvl="4" w:tplc="406A8C16">
       <w:start w:val="1"/>
-      <w:numFmt w:val="bullet"/>
-      <w:lvlText w:val="o"/>
+      <w:numFmt w:val="lowerLetter"/>
+      <w:lvlText w:val="%5"/>
       <w:lvlJc w:val="left"/>
       <w:pPr>
         <w:ind w:left="3300"/>
       </w:pPr>
       <w:rPr>
-        <w:rFonts w:ascii="Arial" w:eastAsia="Arial" w:hAnsi="Arial" w:cs="Arial"/>
+        <w:rFonts w:ascii="Courier New" w:eastAsia="Courier New" w:hAnsi="Courier New" w:cs="Courier New"/>
         <w:b w:val="0"/>
         <w:i w:val="0"/>
         <w:strike w:val="0"/>
         <w:dstrike w:val="0"/>
         <w:color w:val="14213D"/>
-        <w:sz w:val="20"/>
-        <w:szCs w:val="20"/>
+        <w:sz w:val="17"/>
+        <w:szCs w:val="17"/>
         <w:u w:val="none" w:color="000000"/>
         <w:bdr w:val="none" w:sz="0" w:space="0" w:color="auto"/>
         <w:shd w:val="clear" w:color="auto" w:fill="auto"/>
         <w:vertAlign w:val="baseline"/>
       </w:rPr>
     </w:lvl>
-    <w:lvl w:ilvl="5" w:tplc="9BB63E72">
+    <w:lvl w:ilvl="5" w:tplc="9F2A9FB6">
       <w:start w:val="1"/>
-      <w:numFmt w:val="bullet"/>
-      <w:lvlText w:val="▪"/>
+      <w:numFmt w:val="lowerRoman"/>
+      <w:lvlText w:val="%6"/>
       <w:lvlJc w:val="left"/>
       <w:pPr>
         <w:ind w:left="4020"/>
       </w:pPr>
       <w:rPr>
-        <w:rFonts w:ascii="Arial" w:eastAsia="Arial" w:hAnsi="Arial" w:cs="Arial"/>
+        <w:rFonts w:ascii="Courier New" w:eastAsia="Courier New" w:hAnsi="Courier New" w:cs="Courier New"/>
         <w:b w:val="0"/>
         <w:i w:val="0"/>
         <w:strike w:val="0"/>
         <w:dstrike w:val="0"/>
         <w:color w:val="14213D"/>
-        <w:sz w:val="20"/>
-        <w:szCs w:val="20"/>
+        <w:sz w:val="17"/>
+        <w:szCs w:val="17"/>
         <w:u w:val="none" w:color="000000"/>
         <w:bdr w:val="none" w:sz="0" w:space="0" w:color="auto"/>
         <w:shd w:val="clear" w:color="auto" w:fill="auto"/>
         <w:vertAlign w:val="baseline"/>
       </w:rPr>
     </w:lvl>
-    <w:lvl w:ilvl="6" w:tplc="0DE6AD94">
+    <w:lvl w:ilvl="6" w:tplc="B1BC16DA">
       <w:start w:val="1"/>
-      <w:numFmt w:val="bullet"/>
-      <w:lvlText w:val="•"/>
+      <w:numFmt w:val="decimal"/>
+      <w:lvlText w:val="%7"/>
       <w:lvlJc w:val="left"/>
       <w:pPr>
         <w:ind w:left="4740"/>
       </w:pPr>
       <w:rPr>
-        <w:rFonts w:ascii="Arial" w:eastAsia="Arial" w:hAnsi="Arial" w:cs="Arial"/>
+        <w:rFonts w:ascii="Courier New" w:eastAsia="Courier New" w:hAnsi="Courier New" w:cs="Courier New"/>
         <w:b w:val="0"/>
         <w:i w:val="0"/>
         <w:strike w:val="0"/>
         <w:dstrike w:val="0"/>
         <w:color w:val="14213D"/>
-        <w:sz w:val="20"/>
-        <w:szCs w:val="20"/>
+        <w:sz w:val="17"/>
+        <w:szCs w:val="17"/>
         <w:u w:val="none" w:color="000000"/>
         <w:bdr w:val="none" w:sz="0" w:space="0" w:color="auto"/>
         <w:shd w:val="clear" w:color="auto" w:fill="auto"/>
         <w:vertAlign w:val="baseline"/>
       </w:rPr>
     </w:lvl>
-    <w:lvl w:ilvl="7" w:tplc="A0903032">
+    <w:lvl w:ilvl="7" w:tplc="EA8241AE">
       <w:start w:val="1"/>
-      <w:numFmt w:val="bullet"/>
-      <w:lvlText w:val="o"/>
+      <w:numFmt w:val="lowerLetter"/>
+      <w:lvlText w:val="%8"/>
       <w:lvlJc w:val="left"/>
       <w:pPr>
         <w:ind w:left="5460"/>
       </w:pPr>
       <w:rPr>
-        <w:rFonts w:ascii="Arial" w:eastAsia="Arial" w:hAnsi="Arial" w:cs="Arial"/>
+        <w:rFonts w:ascii="Courier New" w:eastAsia="Courier New" w:hAnsi="Courier New" w:cs="Courier New"/>
         <w:b w:val="0"/>
         <w:i w:val="0"/>
         <w:strike w:val="0"/>
         <w:dstrike w:val="0"/>
         <w:color w:val="14213D"/>
-        <w:sz w:val="20"/>
-        <w:szCs w:val="20"/>
+        <w:sz w:val="17"/>
+        <w:szCs w:val="17"/>
         <w:u w:val="none" w:color="000000"/>
         <w:bdr w:val="none" w:sz="0" w:space="0" w:color="auto"/>
         <w:shd w:val="clear" w:color="auto" w:fill="auto"/>
         <w:vertAlign w:val="baseline"/>
       </w:rPr>
     </w:lvl>
-    <w:lvl w:ilvl="8" w:tplc="66C4C21E">
+    <w:lvl w:ilvl="8" w:tplc="2814EF0E">
       <w:start w:val="1"/>
-      <w:numFmt w:val="bullet"/>
-      <w:lvlText w:val="▪"/>
+      <w:numFmt w:val="lowerRoman"/>
+      <w:lvlText w:val="%9"/>
       <w:lvlJc w:val="left"/>
       <w:pPr>
         <w:ind w:left="6180"/>
       </w:pPr>
       <w:rPr>
-        <w:rFonts w:ascii="Arial" w:eastAsia="Arial" w:hAnsi="Arial" w:cs="Arial"/>
+        <w:rFonts w:ascii="Courier New" w:eastAsia="Courier New" w:hAnsi="Courier New" w:cs="Courier New"/>
         <w:b w:val="0"/>
         <w:i w:val="0"/>
         <w:strike w:val="0"/>
         <w:dstrike w:val="0"/>
         <w:color w:val="14213D"/>
-        <w:sz w:val="20"/>
-        <w:szCs w:val="20"/>
+        <w:sz w:val="17"/>
+        <w:szCs w:val="17"/>
         <w:u w:val="none" w:color="000000"/>
         <w:bdr w:val="none" w:sz="0" w:space="0" w:color="auto"/>
         <w:shd w:val="clear" w:color="auto" w:fill="auto"/>
@@ -8091,10 +8906,10 @@
       </w:rPr>
     </w:lvl>
   </w:abstractNum>
-  <w:abstractNum w:abstractNumId="5" w15:restartNumberingAfterBreak="0">
-    <w:nsid w:val="3D0E0E90"/>
+  <w:abstractNum w:abstractNumId="9" w15:restartNumberingAfterBreak="0">
+    <w:nsid w:val="5ACD34BF"/>
     <w:multiLevelType w:val="multilevel"/>
-    <w:tmpl w:val="CFFC8F4E"/>
+    <w:tmpl w:val="6B225E8A"/>
     <w:lvl w:ilvl="0">
       <w:start w:val="1"/>
       <w:numFmt w:val="decimal"/>
@@ -8314,883 +9129,35 @@
       </w:rPr>
     </w:lvl>
   </w:abstractNum>
-  <w:abstractNum w:abstractNumId="6" w15:restartNumberingAfterBreak="0">
-    <w:nsid w:val="40DE4964"/>
-    <w:multiLevelType w:val="hybridMultilevel"/>
-    <w:tmpl w:val="7D9077D8"/>
-    <w:lvl w:ilvl="0" w:tplc="07C8DE9A">
-      <w:start w:val="1"/>
-      <w:numFmt w:val="decimal"/>
-      <w:lvlText w:val="%1."/>
-      <w:lvlJc w:val="left"/>
-      <w:pPr>
-        <w:ind w:left="347"/>
-      </w:pPr>
-      <w:rPr>
-        <w:rFonts w:ascii="Courier New" w:eastAsia="Courier New" w:hAnsi="Courier New" w:cs="Courier New"/>
-        <w:b w:val="0"/>
-        <w:i w:val="0"/>
-        <w:strike w:val="0"/>
-        <w:dstrike w:val="0"/>
-        <w:color w:val="14213D"/>
-        <w:sz w:val="17"/>
-        <w:szCs w:val="17"/>
-        <w:u w:val="none" w:color="000000"/>
-        <w:bdr w:val="none" w:sz="0" w:space="0" w:color="auto"/>
-        <w:shd w:val="clear" w:color="auto" w:fill="auto"/>
-        <w:vertAlign w:val="baseline"/>
-      </w:rPr>
-    </w:lvl>
-    <w:lvl w:ilvl="1" w:tplc="62F01C66">
-      <w:start w:val="1"/>
-      <w:numFmt w:val="lowerLetter"/>
-      <w:lvlText w:val="%2"/>
-      <w:lvlJc w:val="left"/>
-      <w:pPr>
-        <w:ind w:left="1140"/>
-      </w:pPr>
-      <w:rPr>
-        <w:rFonts w:ascii="Courier New" w:eastAsia="Courier New" w:hAnsi="Courier New" w:cs="Courier New"/>
-        <w:b w:val="0"/>
-        <w:i w:val="0"/>
-        <w:strike w:val="0"/>
-        <w:dstrike w:val="0"/>
-        <w:color w:val="14213D"/>
-        <w:sz w:val="17"/>
-        <w:szCs w:val="17"/>
-        <w:u w:val="none" w:color="000000"/>
-        <w:bdr w:val="none" w:sz="0" w:space="0" w:color="auto"/>
-        <w:shd w:val="clear" w:color="auto" w:fill="auto"/>
-        <w:vertAlign w:val="baseline"/>
-      </w:rPr>
-    </w:lvl>
-    <w:lvl w:ilvl="2" w:tplc="BB60C1E4">
-      <w:start w:val="1"/>
-      <w:numFmt w:val="lowerRoman"/>
-      <w:lvlText w:val="%3"/>
-      <w:lvlJc w:val="left"/>
-      <w:pPr>
-        <w:ind w:left="1860"/>
-      </w:pPr>
-      <w:rPr>
-        <w:rFonts w:ascii="Courier New" w:eastAsia="Courier New" w:hAnsi="Courier New" w:cs="Courier New"/>
-        <w:b w:val="0"/>
-        <w:i w:val="0"/>
-        <w:strike w:val="0"/>
-        <w:dstrike w:val="0"/>
-        <w:color w:val="14213D"/>
-        <w:sz w:val="17"/>
-        <w:szCs w:val="17"/>
-        <w:u w:val="none" w:color="000000"/>
-        <w:bdr w:val="none" w:sz="0" w:space="0" w:color="auto"/>
-        <w:shd w:val="clear" w:color="auto" w:fill="auto"/>
-        <w:vertAlign w:val="baseline"/>
-      </w:rPr>
-    </w:lvl>
-    <w:lvl w:ilvl="3" w:tplc="DF405FD4">
-      <w:start w:val="1"/>
-      <w:numFmt w:val="decimal"/>
-      <w:lvlText w:val="%4"/>
-      <w:lvlJc w:val="left"/>
-      <w:pPr>
-        <w:ind w:left="2580"/>
-      </w:pPr>
-      <w:rPr>
-        <w:rFonts w:ascii="Courier New" w:eastAsia="Courier New" w:hAnsi="Courier New" w:cs="Courier New"/>
-        <w:b w:val="0"/>
-        <w:i w:val="0"/>
-        <w:strike w:val="0"/>
-        <w:dstrike w:val="0"/>
-        <w:color w:val="14213D"/>
-        <w:sz w:val="17"/>
-        <w:szCs w:val="17"/>
-        <w:u w:val="none" w:color="000000"/>
-        <w:bdr w:val="none" w:sz="0" w:space="0" w:color="auto"/>
-        <w:shd w:val="clear" w:color="auto" w:fill="auto"/>
-        <w:vertAlign w:val="baseline"/>
-      </w:rPr>
-    </w:lvl>
-    <w:lvl w:ilvl="4" w:tplc="A748E754">
-      <w:start w:val="1"/>
-      <w:numFmt w:val="lowerLetter"/>
-      <w:lvlText w:val="%5"/>
-      <w:lvlJc w:val="left"/>
-      <w:pPr>
-        <w:ind w:left="3300"/>
-      </w:pPr>
-      <w:rPr>
-        <w:rFonts w:ascii="Courier New" w:eastAsia="Courier New" w:hAnsi="Courier New" w:cs="Courier New"/>
-        <w:b w:val="0"/>
-        <w:i w:val="0"/>
-        <w:strike w:val="0"/>
-        <w:dstrike w:val="0"/>
-        <w:color w:val="14213D"/>
-        <w:sz w:val="17"/>
-        <w:szCs w:val="17"/>
-        <w:u w:val="none" w:color="000000"/>
-        <w:bdr w:val="none" w:sz="0" w:space="0" w:color="auto"/>
-        <w:shd w:val="clear" w:color="auto" w:fill="auto"/>
-        <w:vertAlign w:val="baseline"/>
-      </w:rPr>
-    </w:lvl>
-    <w:lvl w:ilvl="5" w:tplc="2A160FA4">
-      <w:start w:val="1"/>
-      <w:numFmt w:val="lowerRoman"/>
-      <w:lvlText w:val="%6"/>
-      <w:lvlJc w:val="left"/>
-      <w:pPr>
-        <w:ind w:left="4020"/>
-      </w:pPr>
-      <w:rPr>
-        <w:rFonts w:ascii="Courier New" w:eastAsia="Courier New" w:hAnsi="Courier New" w:cs="Courier New"/>
-        <w:b w:val="0"/>
-        <w:i w:val="0"/>
-        <w:strike w:val="0"/>
-        <w:dstrike w:val="0"/>
-        <w:color w:val="14213D"/>
-        <w:sz w:val="17"/>
-        <w:szCs w:val="17"/>
-        <w:u w:val="none" w:color="000000"/>
-        <w:bdr w:val="none" w:sz="0" w:space="0" w:color="auto"/>
-        <w:shd w:val="clear" w:color="auto" w:fill="auto"/>
-        <w:vertAlign w:val="baseline"/>
-      </w:rPr>
-    </w:lvl>
-    <w:lvl w:ilvl="6" w:tplc="8034F1B0">
-      <w:start w:val="1"/>
-      <w:numFmt w:val="decimal"/>
-      <w:lvlText w:val="%7"/>
-      <w:lvlJc w:val="left"/>
-      <w:pPr>
-        <w:ind w:left="4740"/>
-      </w:pPr>
-      <w:rPr>
-        <w:rFonts w:ascii="Courier New" w:eastAsia="Courier New" w:hAnsi="Courier New" w:cs="Courier New"/>
-        <w:b w:val="0"/>
-        <w:i w:val="0"/>
-        <w:strike w:val="0"/>
-        <w:dstrike w:val="0"/>
-        <w:color w:val="14213D"/>
-        <w:sz w:val="17"/>
-        <w:szCs w:val="17"/>
-        <w:u w:val="none" w:color="000000"/>
-        <w:bdr w:val="none" w:sz="0" w:space="0" w:color="auto"/>
-        <w:shd w:val="clear" w:color="auto" w:fill="auto"/>
-        <w:vertAlign w:val="baseline"/>
-      </w:rPr>
-    </w:lvl>
-    <w:lvl w:ilvl="7" w:tplc="A38CA0B0">
-      <w:start w:val="1"/>
-      <w:numFmt w:val="lowerLetter"/>
-      <w:lvlText w:val="%8"/>
-      <w:lvlJc w:val="left"/>
-      <w:pPr>
-        <w:ind w:left="5460"/>
-      </w:pPr>
-      <w:rPr>
-        <w:rFonts w:ascii="Courier New" w:eastAsia="Courier New" w:hAnsi="Courier New" w:cs="Courier New"/>
-        <w:b w:val="0"/>
-        <w:i w:val="0"/>
-        <w:strike w:val="0"/>
-        <w:dstrike w:val="0"/>
-        <w:color w:val="14213D"/>
-        <w:sz w:val="17"/>
-        <w:szCs w:val="17"/>
-        <w:u w:val="none" w:color="000000"/>
-        <w:bdr w:val="none" w:sz="0" w:space="0" w:color="auto"/>
-        <w:shd w:val="clear" w:color="auto" w:fill="auto"/>
-        <w:vertAlign w:val="baseline"/>
-      </w:rPr>
-    </w:lvl>
-    <w:lvl w:ilvl="8" w:tplc="2E20DAF8">
-      <w:start w:val="1"/>
-      <w:numFmt w:val="lowerRoman"/>
-      <w:lvlText w:val="%9"/>
-      <w:lvlJc w:val="left"/>
-      <w:pPr>
-        <w:ind w:left="6180"/>
-      </w:pPr>
-      <w:rPr>
-        <w:rFonts w:ascii="Courier New" w:eastAsia="Courier New" w:hAnsi="Courier New" w:cs="Courier New"/>
-        <w:b w:val="0"/>
-        <w:i w:val="0"/>
-        <w:strike w:val="0"/>
-        <w:dstrike w:val="0"/>
-        <w:color w:val="14213D"/>
-        <w:sz w:val="17"/>
-        <w:szCs w:val="17"/>
-        <w:u w:val="none" w:color="000000"/>
-        <w:bdr w:val="none" w:sz="0" w:space="0" w:color="auto"/>
-        <w:shd w:val="clear" w:color="auto" w:fill="auto"/>
-        <w:vertAlign w:val="baseline"/>
-      </w:rPr>
-    </w:lvl>
-  </w:abstractNum>
-  <w:abstractNum w:abstractNumId="7" w15:restartNumberingAfterBreak="0">
-    <w:nsid w:val="475A7FDF"/>
-    <w:multiLevelType w:val="hybridMultilevel"/>
-    <w:tmpl w:val="CD9EB7B0"/>
-    <w:lvl w:ilvl="0" w:tplc="713A24A2">
-      <w:start w:val="1"/>
-      <w:numFmt w:val="bullet"/>
-      <w:lvlText w:val="-"/>
-      <w:lvlJc w:val="left"/>
-      <w:pPr>
-        <w:ind w:left="220"/>
-      </w:pPr>
-      <w:rPr>
-        <w:rFonts w:ascii="Arial" w:eastAsia="Arial" w:hAnsi="Arial" w:cs="Arial"/>
-        <w:b w:val="0"/>
-        <w:i w:val="0"/>
-        <w:strike w:val="0"/>
-        <w:dstrike w:val="0"/>
-        <w:color w:val="14213D"/>
-        <w:sz w:val="20"/>
-        <w:szCs w:val="20"/>
-        <w:u w:val="none" w:color="000000"/>
-        <w:bdr w:val="none" w:sz="0" w:space="0" w:color="auto"/>
-        <w:shd w:val="clear" w:color="auto" w:fill="auto"/>
-        <w:vertAlign w:val="baseline"/>
-      </w:rPr>
-    </w:lvl>
-    <w:lvl w:ilvl="1" w:tplc="C624C7E2">
-      <w:start w:val="1"/>
-      <w:numFmt w:val="bullet"/>
-      <w:lvlText w:val="o"/>
-      <w:lvlJc w:val="left"/>
-      <w:pPr>
-        <w:ind w:left="1140"/>
-      </w:pPr>
-      <w:rPr>
-        <w:rFonts w:ascii="Arial" w:eastAsia="Arial" w:hAnsi="Arial" w:cs="Arial"/>
-        <w:b w:val="0"/>
-        <w:i w:val="0"/>
-        <w:strike w:val="0"/>
-        <w:dstrike w:val="0"/>
-        <w:color w:val="14213D"/>
-        <w:sz w:val="20"/>
-        <w:szCs w:val="20"/>
-        <w:u w:val="none" w:color="000000"/>
-        <w:bdr w:val="none" w:sz="0" w:space="0" w:color="auto"/>
-        <w:shd w:val="clear" w:color="auto" w:fill="auto"/>
-        <w:vertAlign w:val="baseline"/>
-      </w:rPr>
-    </w:lvl>
-    <w:lvl w:ilvl="2" w:tplc="AC0028C4">
-      <w:start w:val="1"/>
-      <w:numFmt w:val="bullet"/>
-      <w:lvlText w:val="▪"/>
-      <w:lvlJc w:val="left"/>
-      <w:pPr>
-        <w:ind w:left="1860"/>
-      </w:pPr>
-      <w:rPr>
-        <w:rFonts w:ascii="Arial" w:eastAsia="Arial" w:hAnsi="Arial" w:cs="Arial"/>
-        <w:b w:val="0"/>
-        <w:i w:val="0"/>
-        <w:strike w:val="0"/>
-        <w:dstrike w:val="0"/>
-        <w:color w:val="14213D"/>
-        <w:sz w:val="20"/>
-        <w:szCs w:val="20"/>
-        <w:u w:val="none" w:color="000000"/>
-        <w:bdr w:val="none" w:sz="0" w:space="0" w:color="auto"/>
-        <w:shd w:val="clear" w:color="auto" w:fill="auto"/>
-        <w:vertAlign w:val="baseline"/>
-      </w:rPr>
-    </w:lvl>
-    <w:lvl w:ilvl="3" w:tplc="464E91A0">
-      <w:start w:val="1"/>
-      <w:numFmt w:val="bullet"/>
-      <w:lvlText w:val="•"/>
-      <w:lvlJc w:val="left"/>
-      <w:pPr>
-        <w:ind w:left="2580"/>
-      </w:pPr>
-      <w:rPr>
-        <w:rFonts w:ascii="Arial" w:eastAsia="Arial" w:hAnsi="Arial" w:cs="Arial"/>
-        <w:b w:val="0"/>
-        <w:i w:val="0"/>
-        <w:strike w:val="0"/>
-        <w:dstrike w:val="0"/>
-        <w:color w:val="14213D"/>
-        <w:sz w:val="20"/>
-        <w:szCs w:val="20"/>
-        <w:u w:val="none" w:color="000000"/>
-        <w:bdr w:val="none" w:sz="0" w:space="0" w:color="auto"/>
-        <w:shd w:val="clear" w:color="auto" w:fill="auto"/>
-        <w:vertAlign w:val="baseline"/>
-      </w:rPr>
-    </w:lvl>
-    <w:lvl w:ilvl="4" w:tplc="30B03ECE">
-      <w:start w:val="1"/>
-      <w:numFmt w:val="bullet"/>
-      <w:lvlText w:val="o"/>
-      <w:lvlJc w:val="left"/>
-      <w:pPr>
-        <w:ind w:left="3300"/>
-      </w:pPr>
-      <w:rPr>
-        <w:rFonts w:ascii="Arial" w:eastAsia="Arial" w:hAnsi="Arial" w:cs="Arial"/>
-        <w:b w:val="0"/>
-        <w:i w:val="0"/>
-        <w:strike w:val="0"/>
-        <w:dstrike w:val="0"/>
-        <w:color w:val="14213D"/>
-        <w:sz w:val="20"/>
-        <w:szCs w:val="20"/>
-        <w:u w:val="none" w:color="000000"/>
-        <w:bdr w:val="none" w:sz="0" w:space="0" w:color="auto"/>
-        <w:shd w:val="clear" w:color="auto" w:fill="auto"/>
-        <w:vertAlign w:val="baseline"/>
-      </w:rPr>
-    </w:lvl>
-    <w:lvl w:ilvl="5" w:tplc="F360430C">
-      <w:start w:val="1"/>
-      <w:numFmt w:val="bullet"/>
-      <w:lvlText w:val="▪"/>
-      <w:lvlJc w:val="left"/>
-      <w:pPr>
-        <w:ind w:left="4020"/>
-      </w:pPr>
-      <w:rPr>
-        <w:rFonts w:ascii="Arial" w:eastAsia="Arial" w:hAnsi="Arial" w:cs="Arial"/>
-        <w:b w:val="0"/>
-        <w:i w:val="0"/>
-        <w:strike w:val="0"/>
-        <w:dstrike w:val="0"/>
-        <w:color w:val="14213D"/>
-        <w:sz w:val="20"/>
-        <w:szCs w:val="20"/>
-        <w:u w:val="none" w:color="000000"/>
-        <w:bdr w:val="none" w:sz="0" w:space="0" w:color="auto"/>
-        <w:shd w:val="clear" w:color="auto" w:fill="auto"/>
-        <w:vertAlign w:val="baseline"/>
-      </w:rPr>
-    </w:lvl>
-    <w:lvl w:ilvl="6" w:tplc="7F3803CE">
-      <w:start w:val="1"/>
-      <w:numFmt w:val="bullet"/>
-      <w:lvlText w:val="•"/>
-      <w:lvlJc w:val="left"/>
-      <w:pPr>
-        <w:ind w:left="4740"/>
-      </w:pPr>
-      <w:rPr>
-        <w:rFonts w:ascii="Arial" w:eastAsia="Arial" w:hAnsi="Arial" w:cs="Arial"/>
-        <w:b w:val="0"/>
-        <w:i w:val="0"/>
-        <w:strike w:val="0"/>
-        <w:dstrike w:val="0"/>
-        <w:color w:val="14213D"/>
-        <w:sz w:val="20"/>
-        <w:szCs w:val="20"/>
-        <w:u w:val="none" w:color="000000"/>
-        <w:bdr w:val="none" w:sz="0" w:space="0" w:color="auto"/>
-        <w:shd w:val="clear" w:color="auto" w:fill="auto"/>
-        <w:vertAlign w:val="baseline"/>
-      </w:rPr>
-    </w:lvl>
-    <w:lvl w:ilvl="7" w:tplc="428C4AD4">
-      <w:start w:val="1"/>
-      <w:numFmt w:val="bullet"/>
-      <w:lvlText w:val="o"/>
-      <w:lvlJc w:val="left"/>
-      <w:pPr>
-        <w:ind w:left="5460"/>
-      </w:pPr>
-      <w:rPr>
-        <w:rFonts w:ascii="Arial" w:eastAsia="Arial" w:hAnsi="Arial" w:cs="Arial"/>
-        <w:b w:val="0"/>
-        <w:i w:val="0"/>
-        <w:strike w:val="0"/>
-        <w:dstrike w:val="0"/>
-        <w:color w:val="14213D"/>
-        <w:sz w:val="20"/>
-        <w:szCs w:val="20"/>
-        <w:u w:val="none" w:color="000000"/>
-        <w:bdr w:val="none" w:sz="0" w:space="0" w:color="auto"/>
-        <w:shd w:val="clear" w:color="auto" w:fill="auto"/>
-        <w:vertAlign w:val="baseline"/>
-      </w:rPr>
-    </w:lvl>
-    <w:lvl w:ilvl="8" w:tplc="0C56A98C">
-      <w:start w:val="1"/>
-      <w:numFmt w:val="bullet"/>
-      <w:lvlText w:val="▪"/>
-      <w:lvlJc w:val="left"/>
-      <w:pPr>
-        <w:ind w:left="6180"/>
-      </w:pPr>
-      <w:rPr>
-        <w:rFonts w:ascii="Arial" w:eastAsia="Arial" w:hAnsi="Arial" w:cs="Arial"/>
-        <w:b w:val="0"/>
-        <w:i w:val="0"/>
-        <w:strike w:val="0"/>
-        <w:dstrike w:val="0"/>
-        <w:color w:val="14213D"/>
-        <w:sz w:val="20"/>
-        <w:szCs w:val="20"/>
-        <w:u w:val="none" w:color="000000"/>
-        <w:bdr w:val="none" w:sz="0" w:space="0" w:color="auto"/>
-        <w:shd w:val="clear" w:color="auto" w:fill="auto"/>
-        <w:vertAlign w:val="baseline"/>
-      </w:rPr>
-    </w:lvl>
-  </w:abstractNum>
-  <w:abstractNum w:abstractNumId="8" w15:restartNumberingAfterBreak="0">
-    <w:nsid w:val="6581518F"/>
-    <w:multiLevelType w:val="hybridMultilevel"/>
-    <w:tmpl w:val="1ECE2CD2"/>
-    <w:lvl w:ilvl="0" w:tplc="F4A8641E">
-      <w:start w:val="1"/>
-      <w:numFmt w:val="bullet"/>
-      <w:lvlText w:val="-"/>
-      <w:lvlJc w:val="left"/>
-      <w:pPr>
-        <w:ind w:left="235"/>
-      </w:pPr>
-      <w:rPr>
-        <w:rFonts w:ascii="Arial" w:eastAsia="Arial" w:hAnsi="Arial" w:cs="Arial"/>
-        <w:b w:val="0"/>
-        <w:i w:val="0"/>
-        <w:strike w:val="0"/>
-        <w:dstrike w:val="0"/>
-        <w:color w:val="14213D"/>
-        <w:sz w:val="20"/>
-        <w:szCs w:val="20"/>
-        <w:u w:val="none" w:color="000000"/>
-        <w:bdr w:val="none" w:sz="0" w:space="0" w:color="auto"/>
-        <w:shd w:val="clear" w:color="auto" w:fill="auto"/>
-        <w:vertAlign w:val="baseline"/>
-      </w:rPr>
-    </w:lvl>
-    <w:lvl w:ilvl="1" w:tplc="35DA39EA">
-      <w:start w:val="1"/>
-      <w:numFmt w:val="bullet"/>
-      <w:lvlText w:val="o"/>
-      <w:lvlJc w:val="left"/>
-      <w:pPr>
-        <w:ind w:left="1140"/>
-      </w:pPr>
-      <w:rPr>
-        <w:rFonts w:ascii="Arial" w:eastAsia="Arial" w:hAnsi="Arial" w:cs="Arial"/>
-        <w:b w:val="0"/>
-        <w:i w:val="0"/>
-        <w:strike w:val="0"/>
-        <w:dstrike w:val="0"/>
-        <w:color w:val="14213D"/>
-        <w:sz w:val="20"/>
-        <w:szCs w:val="20"/>
-        <w:u w:val="none" w:color="000000"/>
-        <w:bdr w:val="none" w:sz="0" w:space="0" w:color="auto"/>
-        <w:shd w:val="clear" w:color="auto" w:fill="auto"/>
-        <w:vertAlign w:val="baseline"/>
-      </w:rPr>
-    </w:lvl>
-    <w:lvl w:ilvl="2" w:tplc="53C04F88">
-      <w:start w:val="1"/>
-      <w:numFmt w:val="bullet"/>
-      <w:lvlText w:val="▪"/>
-      <w:lvlJc w:val="left"/>
-      <w:pPr>
-        <w:ind w:left="1860"/>
-      </w:pPr>
-      <w:rPr>
-        <w:rFonts w:ascii="Arial" w:eastAsia="Arial" w:hAnsi="Arial" w:cs="Arial"/>
-        <w:b w:val="0"/>
-        <w:i w:val="0"/>
-        <w:strike w:val="0"/>
-        <w:dstrike w:val="0"/>
-        <w:color w:val="14213D"/>
-        <w:sz w:val="20"/>
-        <w:szCs w:val="20"/>
-        <w:u w:val="none" w:color="000000"/>
-        <w:bdr w:val="none" w:sz="0" w:space="0" w:color="auto"/>
-        <w:shd w:val="clear" w:color="auto" w:fill="auto"/>
-        <w:vertAlign w:val="baseline"/>
-      </w:rPr>
-    </w:lvl>
-    <w:lvl w:ilvl="3" w:tplc="A22278F6">
-      <w:start w:val="1"/>
-      <w:numFmt w:val="bullet"/>
-      <w:lvlText w:val="•"/>
-      <w:lvlJc w:val="left"/>
-      <w:pPr>
-        <w:ind w:left="2580"/>
-      </w:pPr>
-      <w:rPr>
-        <w:rFonts w:ascii="Arial" w:eastAsia="Arial" w:hAnsi="Arial" w:cs="Arial"/>
-        <w:b w:val="0"/>
-        <w:i w:val="0"/>
-        <w:strike w:val="0"/>
-        <w:dstrike w:val="0"/>
-        <w:color w:val="14213D"/>
-        <w:sz w:val="20"/>
-        <w:szCs w:val="20"/>
-        <w:u w:val="none" w:color="000000"/>
-        <w:bdr w:val="none" w:sz="0" w:space="0" w:color="auto"/>
-        <w:shd w:val="clear" w:color="auto" w:fill="auto"/>
-        <w:vertAlign w:val="baseline"/>
-      </w:rPr>
-    </w:lvl>
-    <w:lvl w:ilvl="4" w:tplc="D4C2BA10">
-      <w:start w:val="1"/>
-      <w:numFmt w:val="bullet"/>
-      <w:lvlText w:val="o"/>
-      <w:lvlJc w:val="left"/>
-      <w:pPr>
-        <w:ind w:left="3300"/>
-      </w:pPr>
-      <w:rPr>
-        <w:rFonts w:ascii="Arial" w:eastAsia="Arial" w:hAnsi="Arial" w:cs="Arial"/>
-        <w:b w:val="0"/>
-        <w:i w:val="0"/>
-        <w:strike w:val="0"/>
-        <w:dstrike w:val="0"/>
-        <w:color w:val="14213D"/>
-        <w:sz w:val="20"/>
-        <w:szCs w:val="20"/>
-        <w:u w:val="none" w:color="000000"/>
-        <w:bdr w:val="none" w:sz="0" w:space="0" w:color="auto"/>
-        <w:shd w:val="clear" w:color="auto" w:fill="auto"/>
-        <w:vertAlign w:val="baseline"/>
-      </w:rPr>
-    </w:lvl>
-    <w:lvl w:ilvl="5" w:tplc="A21C7DC6">
-      <w:start w:val="1"/>
-      <w:numFmt w:val="bullet"/>
-      <w:lvlText w:val="▪"/>
-      <w:lvlJc w:val="left"/>
-      <w:pPr>
-        <w:ind w:left="4020"/>
-      </w:pPr>
-      <w:rPr>
-        <w:rFonts w:ascii="Arial" w:eastAsia="Arial" w:hAnsi="Arial" w:cs="Arial"/>
-        <w:b w:val="0"/>
-        <w:i w:val="0"/>
-        <w:strike w:val="0"/>
-        <w:dstrike w:val="0"/>
-        <w:color w:val="14213D"/>
-        <w:sz w:val="20"/>
-        <w:szCs w:val="20"/>
-        <w:u w:val="none" w:color="000000"/>
-        <w:bdr w:val="none" w:sz="0" w:space="0" w:color="auto"/>
-        <w:shd w:val="clear" w:color="auto" w:fill="auto"/>
-        <w:vertAlign w:val="baseline"/>
-      </w:rPr>
-    </w:lvl>
-    <w:lvl w:ilvl="6" w:tplc="74EAC0AA">
-      <w:start w:val="1"/>
-      <w:numFmt w:val="bullet"/>
-      <w:lvlText w:val="•"/>
-      <w:lvlJc w:val="left"/>
-      <w:pPr>
-        <w:ind w:left="4740"/>
-      </w:pPr>
-      <w:rPr>
-        <w:rFonts w:ascii="Arial" w:eastAsia="Arial" w:hAnsi="Arial" w:cs="Arial"/>
-        <w:b w:val="0"/>
-        <w:i w:val="0"/>
-        <w:strike w:val="0"/>
-        <w:dstrike w:val="0"/>
-        <w:color w:val="14213D"/>
-        <w:sz w:val="20"/>
-        <w:szCs w:val="20"/>
-        <w:u w:val="none" w:color="000000"/>
-        <w:bdr w:val="none" w:sz="0" w:space="0" w:color="auto"/>
-        <w:shd w:val="clear" w:color="auto" w:fill="auto"/>
-        <w:vertAlign w:val="baseline"/>
-      </w:rPr>
-    </w:lvl>
-    <w:lvl w:ilvl="7" w:tplc="D98431E6">
-      <w:start w:val="1"/>
-      <w:numFmt w:val="bullet"/>
-      <w:lvlText w:val="o"/>
-      <w:lvlJc w:val="left"/>
-      <w:pPr>
-        <w:ind w:left="5460"/>
-      </w:pPr>
-      <w:rPr>
-        <w:rFonts w:ascii="Arial" w:eastAsia="Arial" w:hAnsi="Arial" w:cs="Arial"/>
-        <w:b w:val="0"/>
-        <w:i w:val="0"/>
-        <w:strike w:val="0"/>
-        <w:dstrike w:val="0"/>
-        <w:color w:val="14213D"/>
-        <w:sz w:val="20"/>
-        <w:szCs w:val="20"/>
-        <w:u w:val="none" w:color="000000"/>
-        <w:bdr w:val="none" w:sz="0" w:space="0" w:color="auto"/>
-        <w:shd w:val="clear" w:color="auto" w:fill="auto"/>
-        <w:vertAlign w:val="baseline"/>
-      </w:rPr>
-    </w:lvl>
-    <w:lvl w:ilvl="8" w:tplc="AA1C7DB8">
-      <w:start w:val="1"/>
-      <w:numFmt w:val="bullet"/>
-      <w:lvlText w:val="▪"/>
-      <w:lvlJc w:val="left"/>
-      <w:pPr>
-        <w:ind w:left="6180"/>
-      </w:pPr>
-      <w:rPr>
-        <w:rFonts w:ascii="Arial" w:eastAsia="Arial" w:hAnsi="Arial" w:cs="Arial"/>
-        <w:b w:val="0"/>
-        <w:i w:val="0"/>
-        <w:strike w:val="0"/>
-        <w:dstrike w:val="0"/>
-        <w:color w:val="14213D"/>
-        <w:sz w:val="20"/>
-        <w:szCs w:val="20"/>
-        <w:u w:val="none" w:color="000000"/>
-        <w:bdr w:val="none" w:sz="0" w:space="0" w:color="auto"/>
-        <w:shd w:val="clear" w:color="auto" w:fill="auto"/>
-        <w:vertAlign w:val="baseline"/>
-      </w:rPr>
-    </w:lvl>
-  </w:abstractNum>
-  <w:abstractNum w:abstractNumId="9" w15:restartNumberingAfterBreak="0">
-    <w:nsid w:val="760320F7"/>
-    <w:multiLevelType w:val="hybridMultilevel"/>
-    <w:tmpl w:val="D340EB52"/>
-    <w:lvl w:ilvl="0" w:tplc="3C7A7E46">
-      <w:start w:val="1"/>
-      <w:numFmt w:val="bullet"/>
-      <w:lvlText w:val="-"/>
-      <w:lvlJc w:val="left"/>
-      <w:pPr>
-        <w:ind w:left="220"/>
-      </w:pPr>
-      <w:rPr>
-        <w:rFonts w:ascii="Arial" w:eastAsia="Arial" w:hAnsi="Arial" w:cs="Arial"/>
-        <w:b w:val="0"/>
-        <w:i w:val="0"/>
-        <w:strike w:val="0"/>
-        <w:dstrike w:val="0"/>
-        <w:color w:val="14213D"/>
-        <w:sz w:val="20"/>
-        <w:szCs w:val="20"/>
-        <w:u w:val="none" w:color="000000"/>
-        <w:bdr w:val="none" w:sz="0" w:space="0" w:color="auto"/>
-        <w:shd w:val="clear" w:color="auto" w:fill="auto"/>
-        <w:vertAlign w:val="baseline"/>
-      </w:rPr>
-    </w:lvl>
-    <w:lvl w:ilvl="1" w:tplc="9FCAB704">
-      <w:start w:val="1"/>
-      <w:numFmt w:val="bullet"/>
-      <w:lvlText w:val="o"/>
-      <w:lvlJc w:val="left"/>
-      <w:pPr>
-        <w:ind w:left="1140"/>
-      </w:pPr>
-      <w:rPr>
-        <w:rFonts w:ascii="Arial" w:eastAsia="Arial" w:hAnsi="Arial" w:cs="Arial"/>
-        <w:b w:val="0"/>
-        <w:i w:val="0"/>
-        <w:strike w:val="0"/>
-        <w:dstrike w:val="0"/>
-        <w:color w:val="14213D"/>
-        <w:sz w:val="20"/>
-        <w:szCs w:val="20"/>
-        <w:u w:val="none" w:color="000000"/>
-        <w:bdr w:val="none" w:sz="0" w:space="0" w:color="auto"/>
-        <w:shd w:val="clear" w:color="auto" w:fill="auto"/>
-        <w:vertAlign w:val="baseline"/>
-      </w:rPr>
-    </w:lvl>
-    <w:lvl w:ilvl="2" w:tplc="C38EB370">
-      <w:start w:val="1"/>
-      <w:numFmt w:val="bullet"/>
-      <w:lvlText w:val="▪"/>
-      <w:lvlJc w:val="left"/>
-      <w:pPr>
-        <w:ind w:left="1860"/>
-      </w:pPr>
-      <w:rPr>
-        <w:rFonts w:ascii="Arial" w:eastAsia="Arial" w:hAnsi="Arial" w:cs="Arial"/>
-        <w:b w:val="0"/>
-        <w:i w:val="0"/>
-        <w:strike w:val="0"/>
-        <w:dstrike w:val="0"/>
-        <w:color w:val="14213D"/>
-        <w:sz w:val="20"/>
-        <w:szCs w:val="20"/>
-        <w:u w:val="none" w:color="000000"/>
-        <w:bdr w:val="none" w:sz="0" w:space="0" w:color="auto"/>
-        <w:shd w:val="clear" w:color="auto" w:fill="auto"/>
-        <w:vertAlign w:val="baseline"/>
-      </w:rPr>
-    </w:lvl>
-    <w:lvl w:ilvl="3" w:tplc="4A2279A6">
-      <w:start w:val="1"/>
-      <w:numFmt w:val="bullet"/>
-      <w:lvlText w:val="•"/>
-      <w:lvlJc w:val="left"/>
-      <w:pPr>
-        <w:ind w:left="2580"/>
-      </w:pPr>
-      <w:rPr>
-        <w:rFonts w:ascii="Arial" w:eastAsia="Arial" w:hAnsi="Arial" w:cs="Arial"/>
-        <w:b w:val="0"/>
-        <w:i w:val="0"/>
-        <w:strike w:val="0"/>
-        <w:dstrike w:val="0"/>
-        <w:color w:val="14213D"/>
-        <w:sz w:val="20"/>
-        <w:szCs w:val="20"/>
-        <w:u w:val="none" w:color="000000"/>
-        <w:bdr w:val="none" w:sz="0" w:space="0" w:color="auto"/>
-        <w:shd w:val="clear" w:color="auto" w:fill="auto"/>
-        <w:vertAlign w:val="baseline"/>
-      </w:rPr>
-    </w:lvl>
-    <w:lvl w:ilvl="4" w:tplc="71C29F3E">
-      <w:start w:val="1"/>
-      <w:numFmt w:val="bullet"/>
-      <w:lvlText w:val="o"/>
-      <w:lvlJc w:val="left"/>
-      <w:pPr>
-        <w:ind w:left="3300"/>
-      </w:pPr>
-      <w:rPr>
-        <w:rFonts w:ascii="Arial" w:eastAsia="Arial" w:hAnsi="Arial" w:cs="Arial"/>
-        <w:b w:val="0"/>
-        <w:i w:val="0"/>
-        <w:strike w:val="0"/>
-        <w:dstrike w:val="0"/>
-        <w:color w:val="14213D"/>
-        <w:sz w:val="20"/>
-        <w:szCs w:val="20"/>
-        <w:u w:val="none" w:color="000000"/>
-        <w:bdr w:val="none" w:sz="0" w:space="0" w:color="auto"/>
-        <w:shd w:val="clear" w:color="auto" w:fill="auto"/>
-        <w:vertAlign w:val="baseline"/>
-      </w:rPr>
-    </w:lvl>
-    <w:lvl w:ilvl="5" w:tplc="823A7150">
-      <w:start w:val="1"/>
-      <w:numFmt w:val="bullet"/>
-      <w:lvlText w:val="▪"/>
-      <w:lvlJc w:val="left"/>
-      <w:pPr>
-        <w:ind w:left="4020"/>
-      </w:pPr>
-      <w:rPr>
-        <w:rFonts w:ascii="Arial" w:eastAsia="Arial" w:hAnsi="Arial" w:cs="Arial"/>
-        <w:b w:val="0"/>
-        <w:i w:val="0"/>
-        <w:strike w:val="0"/>
-        <w:dstrike w:val="0"/>
-        <w:color w:val="14213D"/>
-        <w:sz w:val="20"/>
-        <w:szCs w:val="20"/>
-        <w:u w:val="none" w:color="000000"/>
-        <w:bdr w:val="none" w:sz="0" w:space="0" w:color="auto"/>
-        <w:shd w:val="clear" w:color="auto" w:fill="auto"/>
-        <w:vertAlign w:val="baseline"/>
-      </w:rPr>
-    </w:lvl>
-    <w:lvl w:ilvl="6" w:tplc="A2B460A6">
-      <w:start w:val="1"/>
-      <w:numFmt w:val="bullet"/>
-      <w:lvlText w:val="•"/>
-      <w:lvlJc w:val="left"/>
-      <w:pPr>
-        <w:ind w:left="4740"/>
-      </w:pPr>
-      <w:rPr>
-        <w:rFonts w:ascii="Arial" w:eastAsia="Arial" w:hAnsi="Arial" w:cs="Arial"/>
-        <w:b w:val="0"/>
-        <w:i w:val="0"/>
-        <w:strike w:val="0"/>
-        <w:dstrike w:val="0"/>
-        <w:color w:val="14213D"/>
-        <w:sz w:val="20"/>
-        <w:szCs w:val="20"/>
-        <w:u w:val="none" w:color="000000"/>
-        <w:bdr w:val="none" w:sz="0" w:space="0" w:color="auto"/>
-        <w:shd w:val="clear" w:color="auto" w:fill="auto"/>
-        <w:vertAlign w:val="baseline"/>
-      </w:rPr>
-    </w:lvl>
-    <w:lvl w:ilvl="7" w:tplc="5A002E94">
-      <w:start w:val="1"/>
-      <w:numFmt w:val="bullet"/>
-      <w:lvlText w:val="o"/>
-      <w:lvlJc w:val="left"/>
-      <w:pPr>
-        <w:ind w:left="5460"/>
-      </w:pPr>
-      <w:rPr>
-        <w:rFonts w:ascii="Arial" w:eastAsia="Arial" w:hAnsi="Arial" w:cs="Arial"/>
-        <w:b w:val="0"/>
-        <w:i w:val="0"/>
-        <w:strike w:val="0"/>
-        <w:dstrike w:val="0"/>
-        <w:color w:val="14213D"/>
-        <w:sz w:val="20"/>
-        <w:szCs w:val="20"/>
-        <w:u w:val="none" w:color="000000"/>
-        <w:bdr w:val="none" w:sz="0" w:space="0" w:color="auto"/>
-        <w:shd w:val="clear" w:color="auto" w:fill="auto"/>
-        <w:vertAlign w:val="baseline"/>
-      </w:rPr>
-    </w:lvl>
-    <w:lvl w:ilvl="8" w:tplc="39A28D96">
-      <w:start w:val="1"/>
-      <w:numFmt w:val="bullet"/>
-      <w:lvlText w:val="▪"/>
-      <w:lvlJc w:val="left"/>
-      <w:pPr>
-        <w:ind w:left="6180"/>
-      </w:pPr>
-      <w:rPr>
-        <w:rFonts w:ascii="Arial" w:eastAsia="Arial" w:hAnsi="Arial" w:cs="Arial"/>
-        <w:b w:val="0"/>
-        <w:i w:val="0"/>
-        <w:strike w:val="0"/>
-        <w:dstrike w:val="0"/>
-        <w:color w:val="14213D"/>
-        <w:sz w:val="20"/>
-        <w:szCs w:val="20"/>
-        <w:u w:val="none" w:color="000000"/>
-        <w:bdr w:val="none" w:sz="0" w:space="0" w:color="auto"/>
-        <w:shd w:val="clear" w:color="auto" w:fill="auto"/>
-        <w:vertAlign w:val="baseline"/>
-      </w:rPr>
-    </w:lvl>
-  </w:abstractNum>
   <w:num w:numId="1">
-    <w:abstractNumId w:val="0"/>
+    <w:abstractNumId w:val="7"/>
   </w:num>
   <w:num w:numId="2">
     <w:abstractNumId w:val="3"/>
   </w:num>
   <w:num w:numId="3">
+    <w:abstractNumId w:val="1"/>
+  </w:num>
+  <w:num w:numId="4">
     <w:abstractNumId w:val="8"/>
   </w:num>
-  <w:num w:numId="4">
+  <w:num w:numId="5">
     <w:abstractNumId w:val="6"/>
-  </w:num>
-  <w:num w:numId="5">
-    <w:abstractNumId w:val="9"/>
   </w:num>
   <w:num w:numId="6">
     <w:abstractNumId w:val="2"/>
   </w:num>
   <w:num w:numId="7">
+    <w:abstractNumId w:val="5"/>
+  </w:num>
+  <w:num w:numId="8">
     <w:abstractNumId w:val="4"/>
   </w:num>
-  <w:num w:numId="8">
-    <w:abstractNumId w:val="7"/>
-  </w:num>
   <w:num w:numId="9">
-    <w:abstractNumId w:val="1"/>
+    <w:abstractNumId w:val="0"/>
   </w:num>
   <w:num w:numId="10">
-    <w:abstractNumId w:val="5"/>
+    <w:abstractNumId w:val="9"/>
   </w:num>
 </w:numbering>
 </file>

</xml_diff>